<commit_message>
make Unit-1, 2, 3 docx file
</commit_message>
<xml_diff>
--- a/Sem-2/SE/Syllabus SE Unit 1/Unit-1.docx
+++ b/Sem-2/SE/Syllabus SE Unit 1/Unit-1.docx
@@ -1081,21 +1081,7 @@
           <w:lang w:val="en-IN"/>
         </w:rPr>
         <w:br/>
-        <w:t xml:space="preserve">The development team </w:t>
-      </w:r>
-      <w:proofErr w:type="spellStart"/>
-      <w:r>
-        <w:rPr>
-          <w:lang w:val="en-IN"/>
-        </w:rPr>
-        <w:t>analyzes</w:t>
-      </w:r>
-      <w:proofErr w:type="spellEnd"/>
-      <w:r>
-        <w:rPr>
-          <w:lang w:val="en-IN"/>
-        </w:rPr>
-        <w:t xml:space="preserve"> what the system should do and documents all requirements.</w:t>
+        <w:t>The development team analyzes what the system should do and documents all requirements.</w:t>
       </w:r>
     </w:p>
     <w:p>
@@ -2213,170 +2199,1262 @@
       <w:r>
         <w:t>Agile is needed to handle frequent changes in requirements, improve customer satisfaction, reduce risks, and deliver quality software faster.</w:t>
       </w:r>
-      <w:r>
-        <w:br/>
-      </w:r>
-      <w:r>
-        <w:br/>
-      </w:r>
-      <w:r>
-        <w:rPr>
-          <w:b/>
-          <w:bCs/>
+    </w:p>
+    <w:p>
+      <w:pPr>
+        <w:pStyle w:val="NormalWeb"/>
+        <w:rPr>
+          <w:b/>
+          <w:bCs/>
+          <w:sz w:val="26"/>
+          <w:szCs w:val="26"/>
+        </w:rPr>
+      </w:pPr>
+      <w:r>
+        <w:rPr>
+          <w:b/>
+          <w:bCs/>
+          <w:sz w:val="26"/>
+          <w:szCs w:val="26"/>
         </w:rPr>
         <w:t>Agile Manifesto:</w:t>
       </w:r>
-      <w:r>
-        <w:br/>
-        <w:t>The Agile Manifesto was introduced in 2001 and defines the core values and principles of Agile development.</w:t>
-      </w:r>
-      <w:r>
-        <w:br/>
-      </w:r>
-      <w:r>
-        <w:br/>
+    </w:p>
+    <w:p>
+      <w:pPr>
+        <w:pStyle w:val="NormalWeb"/>
+        <w:rPr>
+          <w:rFonts w:asciiTheme="minorHAnsi" w:hAnsiTheme="minorHAnsi" w:cstheme="minorHAnsi"/>
+        </w:rPr>
+      </w:pPr>
+      <w:r>
+        <w:rPr>
+          <w:rFonts w:asciiTheme="minorHAnsi" w:hAnsiTheme="minorHAnsi" w:cstheme="minorHAnsi"/>
+        </w:rPr>
+        <w:t xml:space="preserve">The </w:t>
+      </w:r>
+      <w:r>
+        <w:rPr>
+          <w:rStyle w:val="Strong"/>
+          <w:rFonts w:asciiTheme="minorHAnsi" w:hAnsiTheme="minorHAnsi" w:cstheme="minorHAnsi"/>
+        </w:rPr>
+        <w:t>Agile Manifesto</w:t>
+      </w:r>
+      <w:r>
+        <w:rPr>
+          <w:rFonts w:asciiTheme="minorHAnsi" w:hAnsiTheme="minorHAnsi" w:cstheme="minorHAnsi"/>
+        </w:rPr>
+        <w:t xml:space="preserve"> was introduced in </w:t>
+      </w:r>
+      <w:r>
+        <w:rPr>
+          <w:rStyle w:val="Strong"/>
+          <w:rFonts w:asciiTheme="minorHAnsi" w:hAnsiTheme="minorHAnsi" w:cstheme="minorHAnsi"/>
+        </w:rPr>
+        <w:t>2001</w:t>
+      </w:r>
+      <w:r>
+        <w:rPr>
+          <w:rFonts w:asciiTheme="minorHAnsi" w:hAnsiTheme="minorHAnsi" w:cstheme="minorHAnsi"/>
+        </w:rPr>
+        <w:t xml:space="preserve"> to improve software development by focusing on flexibility, collaboration, and customer satisfaction.</w:t>
+      </w:r>
+    </w:p>
+    <w:p>
+      <w:pPr>
+        <w:pStyle w:val="NormalWeb"/>
+        <w:rPr>
+          <w:rFonts w:asciiTheme="minorHAnsi" w:hAnsiTheme="minorHAnsi" w:cstheme="minorHAnsi"/>
+          <w:b/>
+          <w:bCs/>
+          <w:sz w:val="22"/>
+          <w:szCs w:val="22"/>
+        </w:rPr>
+      </w:pPr>
+      <w:r>
+        <w:rPr>
+          <w:b/>
+          <w:bCs/>
+          <w:sz w:val="22"/>
+          <w:szCs w:val="22"/>
+        </w:rPr>
         <w:t>Four Values of Agile Manifesto:</w:t>
       </w:r>
-      <w:r>
-        <w:br/>
-        <w:t>1. Individuals and interactions over processes and tools</w:t>
-      </w:r>
-      <w:r>
-        <w:br/>
-        <w:t>2. Working software over comprehensive documentation</w:t>
-      </w:r>
-      <w:r>
-        <w:br/>
-        <w:t>3. Customer collaboration over contract negotiation</w:t>
-      </w:r>
-      <w:r>
-        <w:br/>
-        <w:t>4. Responding to change over following a plan</w:t>
-      </w:r>
-      <w:r>
-        <w:br/>
-      </w:r>
-      <w:r>
-        <w:br/>
-      </w:r>
-      <w:r>
-        <w:rPr>
-          <w:b/>
-          <w:bCs/>
-        </w:rPr>
-        <w:t>Agile Principles:</w:t>
-      </w:r>
-      <w:r>
-        <w:rPr>
-          <w:b/>
-          <w:bCs/>
-        </w:rPr>
-        <w:br/>
-      </w:r>
-      <w:r>
-        <w:t xml:space="preserve">Agile is based on 12 principles including customer satisfaction, welcoming change, frequent delivery, collaboration, motivated teams, simplicity, </w:t>
-      </w:r>
-      <w:r>
-        <w:br/>
-        <w:t>technical excellence, self-organizing teams, and continuous improvement.</w:t>
-      </w:r>
-      <w:r>
-        <w:br/>
-      </w:r>
-      <w:r>
-        <w:br/>
-        <w:t>Scrum Framework:</w:t>
-      </w:r>
-      <w:r>
-        <w:br/>
-        <w:t>Scrum is a popular Agile framework used for managing complex projects.</w:t>
-      </w:r>
-      <w:r>
-        <w:br/>
-      </w:r>
-      <w:r>
-        <w:br/>
-        <w:t>Scrum Roles:</w:t>
-      </w:r>
-      <w:r>
-        <w:br/>
-        <w:t>- Product Owner</w:t>
-      </w:r>
-      <w:r>
-        <w:br/>
-        <w:t>- Scrum Master</w:t>
-      </w:r>
-      <w:r>
-        <w:br/>
-        <w:t>- Development Team</w:t>
-      </w:r>
-      <w:r>
-        <w:br/>
-      </w:r>
-      <w:r>
-        <w:br/>
-        <w:t>Scrum Artifacts:</w:t>
-      </w:r>
-      <w:r>
-        <w:br/>
-        <w:t>- Product Backlog</w:t>
-      </w:r>
-      <w:r>
-        <w:br/>
-        <w:t>- Sprint Backlog</w:t>
-      </w:r>
-      <w:r>
-        <w:br/>
-        <w:t>- Increment</w:t>
-      </w:r>
-      <w:r>
-        <w:br/>
-      </w:r>
-      <w:r>
-        <w:br/>
-        <w:t>Scrum Events:</w:t>
-      </w:r>
-      <w:r>
-        <w:br/>
-        <w:t>- Sprint Planning</w:t>
-      </w:r>
-      <w:r>
-        <w:br/>
-        <w:t>- Daily Scrum</w:t>
-      </w:r>
-      <w:r>
-        <w:br/>
-        <w:t>- Sprint Review</w:t>
-      </w:r>
-      <w:r>
-        <w:br/>
-        <w:t>- Sprint Retrospective</w:t>
-      </w:r>
-      <w:r>
-        <w:br/>
-      </w:r>
-      <w:r>
-        <w:br/>
-        <w:t>Self-Organizing Teams:</w:t>
-      </w:r>
-      <w:r>
-        <w:br/>
-        <w:t>Self-organizing teams decide how to perform their work. They promote collaboration, responsibility, innovation, and high productivity.</w:t>
-      </w:r>
-      <w:r>
-        <w:br/>
-      </w:r>
-      <w:r>
+    </w:p>
+    <w:p>
+      <w:pPr>
+        <w:pStyle w:val="NormalWeb"/>
+        <w:numPr>
+          <w:ilvl w:val="0"/>
+          <w:numId w:val="12"/>
+        </w:numPr>
+        <w:rPr>
+          <w:rFonts w:asciiTheme="minorHAnsi" w:hAnsiTheme="minorHAnsi" w:cstheme="minorHAnsi"/>
+          <w:sz w:val="22"/>
+          <w:szCs w:val="22"/>
+        </w:rPr>
+      </w:pPr>
+      <w:r>
+        <w:rPr>
+          <w:rStyle w:val="Strong"/>
+          <w:rFonts w:asciiTheme="minorHAnsi" w:hAnsiTheme="minorHAnsi" w:cstheme="minorHAnsi"/>
+          <w:sz w:val="22"/>
+          <w:szCs w:val="22"/>
+        </w:rPr>
+        <w:t>Individuals and interactions</w:t>
+      </w:r>
+      <w:r>
+        <w:rPr>
+          <w:rFonts w:asciiTheme="minorHAnsi" w:hAnsiTheme="minorHAnsi" w:cstheme="minorHAnsi"/>
+          <w:sz w:val="22"/>
+          <w:szCs w:val="22"/>
+        </w:rPr>
+        <w:t xml:space="preserve"> over processes and tools</w:t>
+      </w:r>
+    </w:p>
+    <w:p>
+      <w:pPr>
+        <w:pStyle w:val="NormalWeb"/>
+        <w:numPr>
+          <w:ilvl w:val="0"/>
+          <w:numId w:val="12"/>
+        </w:numPr>
+        <w:rPr>
+          <w:rFonts w:asciiTheme="minorHAnsi" w:hAnsiTheme="minorHAnsi" w:cstheme="minorHAnsi"/>
+          <w:sz w:val="22"/>
+          <w:szCs w:val="22"/>
+        </w:rPr>
+      </w:pPr>
+      <w:r>
+        <w:rPr>
+          <w:rStyle w:val="Strong"/>
+          <w:rFonts w:asciiTheme="minorHAnsi" w:hAnsiTheme="minorHAnsi" w:cstheme="minorHAnsi"/>
+          <w:sz w:val="22"/>
+          <w:szCs w:val="22"/>
+        </w:rPr>
+        <w:t>Working software</w:t>
+      </w:r>
+      <w:r>
+        <w:rPr>
+          <w:rFonts w:asciiTheme="minorHAnsi" w:hAnsiTheme="minorHAnsi" w:cstheme="minorHAnsi"/>
+          <w:sz w:val="22"/>
+          <w:szCs w:val="22"/>
+        </w:rPr>
+        <w:t xml:space="preserve"> over comprehensive documentation</w:t>
+      </w:r>
+    </w:p>
+    <w:p>
+      <w:pPr>
+        <w:pStyle w:val="NormalWeb"/>
+        <w:numPr>
+          <w:ilvl w:val="0"/>
+          <w:numId w:val="12"/>
+        </w:numPr>
+        <w:rPr>
+          <w:rFonts w:asciiTheme="minorHAnsi" w:hAnsiTheme="minorHAnsi" w:cstheme="minorHAnsi"/>
+          <w:sz w:val="22"/>
+          <w:szCs w:val="22"/>
+        </w:rPr>
+      </w:pPr>
+      <w:r>
+        <w:rPr>
+          <w:rStyle w:val="Strong"/>
+          <w:rFonts w:asciiTheme="minorHAnsi" w:hAnsiTheme="minorHAnsi" w:cstheme="minorHAnsi"/>
+          <w:sz w:val="22"/>
+          <w:szCs w:val="22"/>
+        </w:rPr>
+        <w:t>Customer collaboration</w:t>
+      </w:r>
+      <w:r>
+        <w:rPr>
+          <w:rFonts w:asciiTheme="minorHAnsi" w:hAnsiTheme="minorHAnsi" w:cstheme="minorHAnsi"/>
+          <w:sz w:val="22"/>
+          <w:szCs w:val="22"/>
+        </w:rPr>
+        <w:t xml:space="preserve"> over contract negotiation</w:t>
+      </w:r>
+    </w:p>
+    <w:p>
+      <w:pPr>
+        <w:pStyle w:val="NormalWeb"/>
+        <w:numPr>
+          <w:ilvl w:val="0"/>
+          <w:numId w:val="12"/>
+        </w:numPr>
+        <w:rPr>
+          <w:rFonts w:asciiTheme="minorHAnsi" w:hAnsiTheme="minorHAnsi" w:cstheme="minorHAnsi"/>
+        </w:rPr>
+      </w:pPr>
+      <w:r>
+        <w:rPr>
+          <w:rStyle w:val="Strong"/>
+          <w:rFonts w:asciiTheme="minorHAnsi" w:hAnsiTheme="minorHAnsi" w:cstheme="minorHAnsi"/>
+          <w:sz w:val="22"/>
+          <w:szCs w:val="22"/>
+        </w:rPr>
+        <w:t>Responding to change</w:t>
+      </w:r>
+      <w:r>
+        <w:rPr>
+          <w:rFonts w:asciiTheme="minorHAnsi" w:hAnsiTheme="minorHAnsi" w:cstheme="minorHAnsi"/>
+          <w:sz w:val="22"/>
+          <w:szCs w:val="22"/>
+        </w:rPr>
+        <w:t xml:space="preserve"> over following a plan</w:t>
+      </w:r>
+    </w:p>
+    <w:p>
+      <w:pPr>
+        <w:pStyle w:val="NormalWeb"/>
+        <w:spacing w:before="0" w:beforeAutospacing="0" w:after="0" w:afterAutospacing="0"/>
+        <w:rPr>
+          <w:rFonts w:asciiTheme="minorHAnsi" w:hAnsiTheme="minorHAnsi" w:cstheme="minorHAnsi"/>
+          <w:sz w:val="22"/>
+          <w:szCs w:val="22"/>
+        </w:rPr>
+      </w:pPr>
+    </w:p>
+    <w:p>
+      <w:pPr>
+        <w:pStyle w:val="NormalWeb"/>
+        <w:spacing w:before="0" w:beforeAutospacing="0" w:after="240" w:afterAutospacing="0"/>
+        <w:rPr>
+          <w:rFonts w:asciiTheme="minorHAnsi" w:hAnsiTheme="minorHAnsi" w:cstheme="minorHAnsi"/>
+          <w:sz w:val="28"/>
+          <w:szCs w:val="28"/>
+        </w:rPr>
+      </w:pPr>
+      <w:r>
+        <w:rPr>
+          <w:rStyle w:val="Strong"/>
+          <w:rFonts w:asciiTheme="minorHAnsi" w:hAnsiTheme="minorHAnsi" w:cstheme="minorHAnsi"/>
+          <w:sz w:val="28"/>
+          <w:szCs w:val="28"/>
+        </w:rPr>
+        <w:t>12 Principles of Agile Software Development</w:t>
+      </w:r>
+    </w:p>
+    <w:p>
+      <w:pPr>
+        <w:pStyle w:val="NormalWeb"/>
+        <w:numPr>
+          <w:ilvl w:val="0"/>
+          <w:numId w:val="13"/>
+        </w:numPr>
+        <w:spacing w:after="0" w:afterAutospacing="0"/>
+        <w:rPr>
+          <w:rFonts w:asciiTheme="minorHAnsi" w:hAnsiTheme="minorHAnsi" w:cstheme="minorHAnsi"/>
+        </w:rPr>
+      </w:pPr>
+      <w:r>
+        <w:rPr>
+          <w:rStyle w:val="Strong"/>
+          <w:rFonts w:asciiTheme="minorHAnsi" w:hAnsiTheme="minorHAnsi" w:cstheme="minorHAnsi"/>
+        </w:rPr>
+        <w:t>Customer satisfaction</w:t>
+      </w:r>
+      <w:r>
+        <w:rPr>
+          <w:rFonts w:asciiTheme="minorHAnsi" w:hAnsiTheme="minorHAnsi" w:cstheme="minorHAnsi"/>
+        </w:rPr>
+        <w:t xml:space="preserve"> through early and continuous delivery of valuable software.</w:t>
+      </w:r>
+    </w:p>
+    <w:p>
+      <w:pPr>
+        <w:pStyle w:val="NormalWeb"/>
+        <w:numPr>
+          <w:ilvl w:val="0"/>
+          <w:numId w:val="13"/>
+        </w:numPr>
+        <w:spacing w:after="0" w:afterAutospacing="0"/>
+        <w:rPr>
+          <w:rFonts w:asciiTheme="minorHAnsi" w:hAnsiTheme="minorHAnsi" w:cstheme="minorHAnsi"/>
+        </w:rPr>
+      </w:pPr>
+      <w:r>
+        <w:rPr>
+          <w:rStyle w:val="Strong"/>
+          <w:rFonts w:asciiTheme="minorHAnsi" w:hAnsiTheme="minorHAnsi" w:cstheme="minorHAnsi"/>
+        </w:rPr>
+        <w:t>Welcome changing requirements</w:t>
+      </w:r>
+      <w:r>
+        <w:rPr>
+          <w:rFonts w:asciiTheme="minorHAnsi" w:hAnsiTheme="minorHAnsi" w:cstheme="minorHAnsi"/>
+        </w:rPr>
+        <w:t>, even late in development, for the customer’s competitive advantage.</w:t>
+      </w:r>
+    </w:p>
+    <w:p>
+      <w:pPr>
+        <w:pStyle w:val="NormalWeb"/>
+        <w:numPr>
+          <w:ilvl w:val="0"/>
+          <w:numId w:val="13"/>
+        </w:numPr>
+        <w:spacing w:after="0" w:afterAutospacing="0"/>
+        <w:rPr>
+          <w:rFonts w:asciiTheme="minorHAnsi" w:hAnsiTheme="minorHAnsi" w:cstheme="minorHAnsi"/>
+        </w:rPr>
+      </w:pPr>
+      <w:r>
+        <w:rPr>
+          <w:rStyle w:val="Strong"/>
+          <w:rFonts w:asciiTheme="minorHAnsi" w:hAnsiTheme="minorHAnsi" w:cstheme="minorHAnsi"/>
+        </w:rPr>
+        <w:t>Deliver working software frequently</w:t>
+      </w:r>
+      <w:r>
+        <w:rPr>
+          <w:rFonts w:asciiTheme="minorHAnsi" w:hAnsiTheme="minorHAnsi" w:cstheme="minorHAnsi"/>
+        </w:rPr>
+        <w:t>, from a few weeks to a few months, with a preference for shorter timescales.</w:t>
+      </w:r>
+    </w:p>
+    <w:p>
+      <w:pPr>
+        <w:pStyle w:val="NormalWeb"/>
+        <w:numPr>
+          <w:ilvl w:val="0"/>
+          <w:numId w:val="13"/>
+        </w:numPr>
+        <w:spacing w:after="0" w:afterAutospacing="0"/>
+        <w:rPr>
+          <w:rFonts w:asciiTheme="minorHAnsi" w:hAnsiTheme="minorHAnsi" w:cstheme="minorHAnsi"/>
+        </w:rPr>
+      </w:pPr>
+      <w:r>
+        <w:rPr>
+          <w:rStyle w:val="Strong"/>
+          <w:rFonts w:asciiTheme="minorHAnsi" w:hAnsiTheme="minorHAnsi" w:cstheme="minorHAnsi"/>
+        </w:rPr>
+        <w:t>Business people and developers must work together daily</w:t>
+      </w:r>
+      <w:r>
+        <w:rPr>
+          <w:rFonts w:asciiTheme="minorHAnsi" w:hAnsiTheme="minorHAnsi" w:cstheme="minorHAnsi"/>
+        </w:rPr>
+        <w:t xml:space="preserve"> throughout the project.</w:t>
+      </w:r>
+    </w:p>
+    <w:p>
+      <w:pPr>
+        <w:pStyle w:val="NormalWeb"/>
+        <w:numPr>
+          <w:ilvl w:val="0"/>
+          <w:numId w:val="13"/>
+        </w:numPr>
+        <w:spacing w:after="0" w:afterAutospacing="0"/>
+        <w:rPr>
+          <w:rFonts w:asciiTheme="minorHAnsi" w:hAnsiTheme="minorHAnsi" w:cstheme="minorHAnsi"/>
+        </w:rPr>
+      </w:pPr>
+      <w:r>
+        <w:rPr>
+          <w:rStyle w:val="Strong"/>
+          <w:rFonts w:asciiTheme="minorHAnsi" w:hAnsiTheme="minorHAnsi" w:cstheme="minorHAnsi"/>
+        </w:rPr>
+        <w:t>Build projects around motivated individuals</w:t>
+      </w:r>
+      <w:r>
+        <w:rPr>
+          <w:rFonts w:asciiTheme="minorHAnsi" w:hAnsiTheme="minorHAnsi" w:cstheme="minorHAnsi"/>
+        </w:rPr>
+        <w:t>, give them the environment and support they need, and trust them to get the job done.</w:t>
+      </w:r>
+    </w:p>
+    <w:p>
+      <w:pPr>
+        <w:pStyle w:val="NormalWeb"/>
+        <w:numPr>
+          <w:ilvl w:val="0"/>
+          <w:numId w:val="13"/>
+        </w:numPr>
+        <w:spacing w:after="0" w:afterAutospacing="0"/>
+        <w:rPr>
+          <w:rFonts w:asciiTheme="minorHAnsi" w:hAnsiTheme="minorHAnsi" w:cstheme="minorHAnsi"/>
+        </w:rPr>
+      </w:pPr>
+      <w:r>
+        <w:rPr>
+          <w:rStyle w:val="Strong"/>
+          <w:rFonts w:asciiTheme="minorHAnsi" w:hAnsiTheme="minorHAnsi" w:cstheme="minorHAnsi"/>
+        </w:rPr>
+        <w:t>Face-to-face conversation</w:t>
+      </w:r>
+      <w:r>
+        <w:rPr>
+          <w:rFonts w:asciiTheme="minorHAnsi" w:hAnsiTheme="minorHAnsi" w:cstheme="minorHAnsi"/>
+        </w:rPr>
+        <w:t xml:space="preserve"> is the most effective and efficient method of conveying information.</w:t>
+      </w:r>
+    </w:p>
+    <w:p>
+      <w:pPr>
+        <w:pStyle w:val="NormalWeb"/>
+        <w:numPr>
+          <w:ilvl w:val="0"/>
+          <w:numId w:val="13"/>
+        </w:numPr>
+        <w:spacing w:after="0" w:afterAutospacing="0"/>
+        <w:rPr>
+          <w:rFonts w:asciiTheme="minorHAnsi" w:hAnsiTheme="minorHAnsi" w:cstheme="minorHAnsi"/>
+        </w:rPr>
+      </w:pPr>
+      <w:r>
+        <w:rPr>
+          <w:rStyle w:val="Strong"/>
+          <w:rFonts w:asciiTheme="minorHAnsi" w:hAnsiTheme="minorHAnsi" w:cstheme="minorHAnsi"/>
+        </w:rPr>
+        <w:t>Working software is the primary measure of progress.</w:t>
+      </w:r>
+    </w:p>
+    <w:p>
+      <w:pPr>
+        <w:pStyle w:val="NormalWeb"/>
+        <w:numPr>
+          <w:ilvl w:val="0"/>
+          <w:numId w:val="13"/>
+        </w:numPr>
+        <w:spacing w:after="0" w:afterAutospacing="0"/>
+        <w:rPr>
+          <w:rFonts w:asciiTheme="minorHAnsi" w:hAnsiTheme="minorHAnsi" w:cstheme="minorHAnsi"/>
+        </w:rPr>
+      </w:pPr>
+      <w:r>
+        <w:rPr>
+          <w:rStyle w:val="Strong"/>
+          <w:rFonts w:asciiTheme="minorHAnsi" w:hAnsiTheme="minorHAnsi" w:cstheme="minorHAnsi"/>
+        </w:rPr>
+        <w:t>Agile processes promote sustainable development</w:t>
+      </w:r>
+      <w:r>
+        <w:rPr>
+          <w:rFonts w:asciiTheme="minorHAnsi" w:hAnsiTheme="minorHAnsi" w:cstheme="minorHAnsi"/>
+        </w:rPr>
+        <w:t xml:space="preserve"> — teams should maintain a constant pace indefinitely.</w:t>
+      </w:r>
+    </w:p>
+    <w:p>
+      <w:pPr>
+        <w:pStyle w:val="NormalWeb"/>
+        <w:numPr>
+          <w:ilvl w:val="0"/>
+          <w:numId w:val="13"/>
+        </w:numPr>
+        <w:spacing w:after="0" w:afterAutospacing="0"/>
+        <w:rPr>
+          <w:rFonts w:asciiTheme="minorHAnsi" w:hAnsiTheme="minorHAnsi" w:cstheme="minorHAnsi"/>
+        </w:rPr>
+      </w:pPr>
+      <w:r>
+        <w:rPr>
+          <w:rStyle w:val="Strong"/>
+          <w:rFonts w:asciiTheme="minorHAnsi" w:hAnsiTheme="minorHAnsi" w:cstheme="minorHAnsi"/>
+        </w:rPr>
+        <w:t>Continuous attention to technical excellence and good design</w:t>
+      </w:r>
+      <w:r>
+        <w:rPr>
+          <w:rFonts w:asciiTheme="minorHAnsi" w:hAnsiTheme="minorHAnsi" w:cstheme="minorHAnsi"/>
+        </w:rPr>
+        <w:t xml:space="preserve"> enhances agility.</w:t>
+      </w:r>
+    </w:p>
+    <w:p>
+      <w:pPr>
+        <w:pStyle w:val="NormalWeb"/>
+        <w:numPr>
+          <w:ilvl w:val="0"/>
+          <w:numId w:val="13"/>
+        </w:numPr>
+        <w:spacing w:after="0" w:afterAutospacing="0"/>
+        <w:rPr>
+          <w:rFonts w:asciiTheme="minorHAnsi" w:hAnsiTheme="minorHAnsi" w:cstheme="minorHAnsi"/>
+        </w:rPr>
+      </w:pPr>
+      <w:r>
+        <w:rPr>
+          <w:rStyle w:val="Strong"/>
+          <w:rFonts w:asciiTheme="minorHAnsi" w:hAnsiTheme="minorHAnsi" w:cstheme="minorHAnsi"/>
+        </w:rPr>
+        <w:t>Simplicity</w:t>
+      </w:r>
+      <w:r>
+        <w:rPr>
+          <w:rFonts w:asciiTheme="minorHAnsi" w:hAnsiTheme="minorHAnsi" w:cstheme="minorHAnsi"/>
+        </w:rPr>
+        <w:t xml:space="preserve"> — the art of maximizing the amount of work not done — is essential.</w:t>
+      </w:r>
+    </w:p>
+    <w:p>
+      <w:pPr>
+        <w:pStyle w:val="NormalWeb"/>
+        <w:numPr>
+          <w:ilvl w:val="0"/>
+          <w:numId w:val="13"/>
+        </w:numPr>
+        <w:spacing w:after="0" w:afterAutospacing="0"/>
+        <w:rPr>
+          <w:rFonts w:asciiTheme="minorHAnsi" w:hAnsiTheme="minorHAnsi" w:cstheme="minorHAnsi"/>
+        </w:rPr>
+      </w:pPr>
+      <w:r>
+        <w:rPr>
+          <w:rStyle w:val="Strong"/>
+          <w:rFonts w:asciiTheme="minorHAnsi" w:hAnsiTheme="minorHAnsi" w:cstheme="minorHAnsi"/>
+        </w:rPr>
+        <w:t>The best architectures, requirements, and designs emerge from self-organizing teams.</w:t>
+      </w:r>
+    </w:p>
+    <w:p>
+      <w:pPr>
+        <w:pStyle w:val="NormalWeb"/>
+        <w:numPr>
+          <w:ilvl w:val="0"/>
+          <w:numId w:val="13"/>
+        </w:numPr>
+        <w:spacing w:after="0" w:afterAutospacing="0"/>
+        <w:rPr>
+          <w:rFonts w:asciiTheme="minorHAnsi" w:hAnsiTheme="minorHAnsi" w:cstheme="minorHAnsi"/>
+        </w:rPr>
+      </w:pPr>
+      <w:r>
+        <w:rPr>
+          <w:rStyle w:val="Strong"/>
+          <w:rFonts w:asciiTheme="minorHAnsi" w:hAnsiTheme="minorHAnsi" w:cstheme="minorHAnsi"/>
+        </w:rPr>
+        <w:t>At regular intervals, the team reflects</w:t>
+      </w:r>
+      <w:r>
+        <w:rPr>
+          <w:rFonts w:asciiTheme="minorHAnsi" w:hAnsiTheme="minorHAnsi" w:cstheme="minorHAnsi"/>
+        </w:rPr>
+        <w:t xml:space="preserve"> on how to become more effective and adjusts its behaviour accordingly.</w:t>
+      </w:r>
+    </w:p>
+    <w:p>
+      <w:pPr>
+        <w:pStyle w:val="NormalWeb"/>
+        <w:spacing w:after="0" w:afterAutospacing="0"/>
+        <w:rPr>
+          <w:rFonts w:asciiTheme="minorHAnsi" w:hAnsiTheme="minorHAnsi" w:cstheme="minorHAnsi"/>
+        </w:rPr>
+      </w:pPr>
+      <w:r>
+        <w:rPr>
+          <w:rFonts w:cstheme="minorHAnsi"/>
+        </w:rPr>
+        <w:pict w14:anchorId="11BB594C">
+          <v:rect id="_x0000_i1090" style="width:498.95pt;height:1.5pt" o:hrpct="990" o:hralign="center" o:hrstd="t" o:hr="t" fillcolor="#a0a0a0" stroked="f"/>
+        </w:pict>
+      </w:r>
+    </w:p>
+    <w:p>
+      <w:pPr>
+        <w:pStyle w:val="NormalWeb"/>
+        <w:rPr>
+          <w:rFonts w:cstheme="minorHAnsi"/>
+          <w:b/>
+          <w:bCs/>
+          <w:sz w:val="26"/>
+          <w:szCs w:val="26"/>
+        </w:rPr>
+      </w:pPr>
+      <w:r>
+        <w:rPr>
+          <w:rFonts w:cstheme="minorHAnsi"/>
+          <w:b/>
+          <w:bCs/>
+          <w:sz w:val="26"/>
+          <w:szCs w:val="26"/>
+        </w:rPr>
+        <w:t>Scrum Framework</w:t>
+      </w:r>
+    </w:p>
+    <w:p>
+      <w:pPr>
+        <w:pStyle w:val="NormalWeb"/>
+        <w:rPr>
+          <w:rFonts w:cstheme="minorHAnsi"/>
+        </w:rPr>
+      </w:pPr>
+      <w:r>
+        <w:rPr>
+          <w:rFonts w:cstheme="minorHAnsi"/>
+        </w:rPr>
+        <w:t xml:space="preserve">Scrum is a </w:t>
+      </w:r>
+      <w:r>
+        <w:rPr>
+          <w:rFonts w:cstheme="minorHAnsi"/>
+          <w:b/>
+          <w:bCs/>
+        </w:rPr>
+        <w:t>popular Agile framework used to manage and develop complex software projects</w:t>
+      </w:r>
+      <w:r>
+        <w:rPr>
+          <w:rFonts w:cstheme="minorHAnsi"/>
+        </w:rPr>
+        <w:t>. It helps teams work in small iterations and deliver software faster with continuous improvement.</w:t>
+      </w:r>
+    </w:p>
+    <w:p>
+      <w:pPr>
+        <w:pStyle w:val="NormalWeb"/>
+        <w:ind w:left="720"/>
+        <w:rPr>
+          <w:rFonts w:cstheme="minorHAnsi"/>
+          <w:b/>
+          <w:bCs/>
+        </w:rPr>
+      </w:pPr>
+      <w:r>
+        <w:rPr>
+          <w:rFonts w:cstheme="minorHAnsi"/>
+          <w:b/>
+          <w:bCs/>
+        </w:rPr>
         <w:lastRenderedPageBreak/>
-        <w:br/>
-        <w:t>Conclusion:</w:t>
-      </w:r>
-      <w:r>
-        <w:br/>
-        <w:t>Agile Methodology helps in developing high-quality software through flexibility, customer involvement, and continuous improvement.</w:t>
-      </w:r>
-      <w:r>
-        <w:br/>
+        <w:t>1. Scrum Roles</w:t>
+      </w:r>
+    </w:p>
+    <w:p>
+      <w:pPr>
+        <w:pStyle w:val="NormalWeb"/>
+        <w:ind w:left="720"/>
+        <w:rPr>
+          <w:rFonts w:cstheme="minorHAnsi"/>
+        </w:rPr>
+      </w:pPr>
+      <w:r>
+        <w:rPr>
+          <w:rFonts w:cstheme="minorHAnsi"/>
+        </w:rPr>
+        <w:t>Scrum defines three important roles:</w:t>
+      </w:r>
+    </w:p>
+    <w:p>
+      <w:pPr>
+        <w:pStyle w:val="NormalWeb"/>
+        <w:numPr>
+          <w:ilvl w:val="0"/>
+          <w:numId w:val="19"/>
+        </w:numPr>
+        <w:tabs>
+          <w:tab w:val="clear" w:pos="720"/>
+          <w:tab w:val="num" w:pos="1440"/>
+        </w:tabs>
+        <w:ind w:left="1440"/>
+        <w:rPr>
+          <w:rFonts w:cstheme="minorHAnsi"/>
+        </w:rPr>
+      </w:pPr>
+      <w:r>
+        <w:rPr>
+          <w:rFonts w:cstheme="minorHAnsi"/>
+          <w:b/>
+          <w:bCs/>
+        </w:rPr>
+        <w:t>Product Owner</w:t>
+      </w:r>
+      <w:r>
+        <w:rPr>
+          <w:rFonts w:cstheme="minorHAnsi"/>
+        </w:rPr>
+        <w:t xml:space="preserve"> – Represents the customer and manages the </w:t>
+      </w:r>
+      <w:r>
+        <w:rPr>
+          <w:rFonts w:cstheme="minorHAnsi"/>
+          <w:b/>
+          <w:bCs/>
+        </w:rPr>
+        <w:t>product backlog</w:t>
+      </w:r>
+      <w:r>
+        <w:rPr>
+          <w:rFonts w:cstheme="minorHAnsi"/>
+        </w:rPr>
+        <w:t xml:space="preserve"> by defining requirements and priorities.</w:t>
+      </w:r>
+    </w:p>
+    <w:p>
+      <w:pPr>
+        <w:pStyle w:val="NormalWeb"/>
+        <w:numPr>
+          <w:ilvl w:val="0"/>
+          <w:numId w:val="19"/>
+        </w:numPr>
+        <w:tabs>
+          <w:tab w:val="clear" w:pos="720"/>
+          <w:tab w:val="num" w:pos="1440"/>
+        </w:tabs>
+        <w:ind w:left="1440"/>
+        <w:rPr>
+          <w:rFonts w:cstheme="minorHAnsi"/>
+        </w:rPr>
+      </w:pPr>
+      <w:r>
+        <w:rPr>
+          <w:rFonts w:cstheme="minorHAnsi"/>
+          <w:b/>
+          <w:bCs/>
+        </w:rPr>
+        <w:t>Scrum Master</w:t>
+      </w:r>
+      <w:r>
+        <w:rPr>
+          <w:rFonts w:cstheme="minorHAnsi"/>
+        </w:rPr>
+        <w:t xml:space="preserve"> – Guides the team, removes obstacles, and ensures that the Scrum process is followed.</w:t>
+      </w:r>
+    </w:p>
+    <w:p>
+      <w:pPr>
+        <w:pStyle w:val="NormalWeb"/>
+        <w:numPr>
+          <w:ilvl w:val="0"/>
+          <w:numId w:val="19"/>
+        </w:numPr>
+        <w:tabs>
+          <w:tab w:val="clear" w:pos="720"/>
+          <w:tab w:val="num" w:pos="1440"/>
+        </w:tabs>
+        <w:ind w:left="1440"/>
+        <w:rPr>
+          <w:rFonts w:cstheme="minorHAnsi"/>
+        </w:rPr>
+      </w:pPr>
+      <w:r>
+        <w:rPr>
+          <w:rFonts w:cstheme="minorHAnsi"/>
+          <w:b/>
+          <w:bCs/>
+        </w:rPr>
+        <w:t>Development Team</w:t>
+      </w:r>
+      <w:r>
+        <w:rPr>
+          <w:rFonts w:cstheme="minorHAnsi"/>
+        </w:rPr>
+        <w:t xml:space="preserve"> – A group of developers who </w:t>
+      </w:r>
+      <w:r>
+        <w:rPr>
+          <w:rFonts w:cstheme="minorHAnsi"/>
+          <w:b/>
+          <w:bCs/>
+        </w:rPr>
+        <w:t>design, build, and test the product</w:t>
+      </w:r>
+      <w:r>
+        <w:rPr>
+          <w:rFonts w:cstheme="minorHAnsi"/>
+        </w:rPr>
+        <w:t>.</w:t>
+      </w:r>
+    </w:p>
+    <w:p>
+      <w:pPr>
+        <w:pStyle w:val="NormalWeb"/>
+        <w:ind w:left="720"/>
+        <w:rPr>
+          <w:rFonts w:cstheme="minorHAnsi"/>
+          <w:b/>
+          <w:bCs/>
+        </w:rPr>
+      </w:pPr>
+      <w:r>
+        <w:rPr>
+          <w:rFonts w:cstheme="minorHAnsi"/>
+          <w:b/>
+          <w:bCs/>
+        </w:rPr>
+        <w:t>2. Scrum Artifacts</w:t>
+      </w:r>
+    </w:p>
+    <w:p>
+      <w:pPr>
+        <w:pStyle w:val="NormalWeb"/>
+        <w:ind w:left="720"/>
+        <w:rPr>
+          <w:rFonts w:cstheme="minorHAnsi"/>
+        </w:rPr>
+      </w:pPr>
+      <w:r>
+        <w:rPr>
+          <w:rFonts w:cstheme="minorHAnsi"/>
+        </w:rPr>
+        <w:t>Artifacts provide important information about the project:</w:t>
+      </w:r>
+    </w:p>
+    <w:p>
+      <w:pPr>
+        <w:pStyle w:val="NormalWeb"/>
+        <w:numPr>
+          <w:ilvl w:val="0"/>
+          <w:numId w:val="20"/>
+        </w:numPr>
+        <w:tabs>
+          <w:tab w:val="clear" w:pos="720"/>
+          <w:tab w:val="num" w:pos="1440"/>
+        </w:tabs>
+        <w:ind w:left="1440"/>
+        <w:rPr>
+          <w:rFonts w:cstheme="minorHAnsi"/>
+        </w:rPr>
+      </w:pPr>
+      <w:r>
+        <w:rPr>
+          <w:rFonts w:cstheme="minorHAnsi"/>
+          <w:b/>
+          <w:bCs/>
+        </w:rPr>
+        <w:t>Product Backlog</w:t>
+      </w:r>
+      <w:r>
+        <w:rPr>
+          <w:rFonts w:cstheme="minorHAnsi"/>
+        </w:rPr>
+        <w:t xml:space="preserve"> – A list of all features and requirements of the product.</w:t>
+      </w:r>
+    </w:p>
+    <w:p>
+      <w:pPr>
+        <w:pStyle w:val="NormalWeb"/>
+        <w:numPr>
+          <w:ilvl w:val="0"/>
+          <w:numId w:val="20"/>
+        </w:numPr>
+        <w:tabs>
+          <w:tab w:val="clear" w:pos="720"/>
+          <w:tab w:val="num" w:pos="1440"/>
+        </w:tabs>
+        <w:ind w:left="1440"/>
+        <w:rPr>
+          <w:rFonts w:cstheme="minorHAnsi"/>
+        </w:rPr>
+      </w:pPr>
+      <w:r>
+        <w:rPr>
+          <w:rFonts w:cstheme="minorHAnsi"/>
+          <w:b/>
+          <w:bCs/>
+        </w:rPr>
+        <w:t>Sprint Backlog</w:t>
+      </w:r>
+      <w:r>
+        <w:rPr>
+          <w:rFonts w:cstheme="minorHAnsi"/>
+        </w:rPr>
+        <w:t xml:space="preserve"> – Tasks selected from the product backlog for the current sprint.</w:t>
+      </w:r>
+    </w:p>
+    <w:p>
+      <w:pPr>
+        <w:pStyle w:val="NormalWeb"/>
+        <w:numPr>
+          <w:ilvl w:val="0"/>
+          <w:numId w:val="20"/>
+        </w:numPr>
+        <w:tabs>
+          <w:tab w:val="clear" w:pos="720"/>
+          <w:tab w:val="num" w:pos="1440"/>
+        </w:tabs>
+        <w:ind w:left="1440"/>
+        <w:rPr>
+          <w:rFonts w:cstheme="minorHAnsi"/>
+        </w:rPr>
+      </w:pPr>
+      <w:r>
+        <w:rPr>
+          <w:rFonts w:cstheme="minorHAnsi"/>
+          <w:b/>
+          <w:bCs/>
+        </w:rPr>
+        <w:t>Increment</w:t>
+      </w:r>
+      <w:r>
+        <w:rPr>
+          <w:rFonts w:cstheme="minorHAnsi"/>
+        </w:rPr>
+        <w:t xml:space="preserve"> – The working product or feature completed during a sprint.</w:t>
+      </w:r>
+    </w:p>
+    <w:p>
+      <w:pPr>
+        <w:pStyle w:val="NormalWeb"/>
+        <w:ind w:left="720"/>
+        <w:rPr>
+          <w:rFonts w:cstheme="minorHAnsi"/>
+          <w:b/>
+          <w:bCs/>
+        </w:rPr>
+      </w:pPr>
+      <w:r>
+        <w:rPr>
+          <w:rFonts w:cstheme="minorHAnsi"/>
+          <w:b/>
+          <w:bCs/>
+        </w:rPr>
+        <w:t>3. Scrum Events</w:t>
+      </w:r>
+    </w:p>
+    <w:p>
+      <w:pPr>
+        <w:pStyle w:val="NormalWeb"/>
+        <w:ind w:left="720"/>
+        <w:rPr>
+          <w:rFonts w:cstheme="minorHAnsi"/>
+        </w:rPr>
+      </w:pPr>
+      <w:r>
+        <w:rPr>
+          <w:rFonts w:cstheme="minorHAnsi"/>
+        </w:rPr>
+        <w:t>Scrum includes several events to manage work:</w:t>
+      </w:r>
+    </w:p>
+    <w:p>
+      <w:pPr>
+        <w:pStyle w:val="NormalWeb"/>
+        <w:numPr>
+          <w:ilvl w:val="0"/>
+          <w:numId w:val="21"/>
+        </w:numPr>
+        <w:tabs>
+          <w:tab w:val="clear" w:pos="720"/>
+          <w:tab w:val="num" w:pos="1440"/>
+        </w:tabs>
+        <w:ind w:left="1440"/>
+        <w:rPr>
+          <w:rFonts w:cstheme="minorHAnsi"/>
+        </w:rPr>
+      </w:pPr>
+      <w:r>
+        <w:rPr>
+          <w:rFonts w:cstheme="minorHAnsi"/>
+          <w:b/>
+          <w:bCs/>
+        </w:rPr>
+        <w:t>Sprint Planning</w:t>
+      </w:r>
+      <w:r>
+        <w:rPr>
+          <w:rFonts w:cstheme="minorHAnsi"/>
+        </w:rPr>
+        <w:t xml:space="preserve"> – The team decides the work to be completed in the sprint.</w:t>
+      </w:r>
+    </w:p>
+    <w:p>
+      <w:pPr>
+        <w:pStyle w:val="NormalWeb"/>
+        <w:numPr>
+          <w:ilvl w:val="0"/>
+          <w:numId w:val="21"/>
+        </w:numPr>
+        <w:tabs>
+          <w:tab w:val="clear" w:pos="720"/>
+          <w:tab w:val="num" w:pos="1440"/>
+        </w:tabs>
+        <w:ind w:left="1440"/>
+        <w:rPr>
+          <w:rFonts w:cstheme="minorHAnsi"/>
+        </w:rPr>
+      </w:pPr>
+      <w:r>
+        <w:rPr>
+          <w:rFonts w:cstheme="minorHAnsi"/>
+          <w:b/>
+          <w:bCs/>
+        </w:rPr>
+        <w:t>Daily Scrum</w:t>
+      </w:r>
+      <w:r>
+        <w:rPr>
+          <w:rFonts w:cstheme="minorHAnsi"/>
+        </w:rPr>
+        <w:t xml:space="preserve"> – A short daily meeting to discuss progress and problems.</w:t>
+      </w:r>
+    </w:p>
+    <w:p>
+      <w:pPr>
+        <w:pStyle w:val="NormalWeb"/>
+        <w:numPr>
+          <w:ilvl w:val="0"/>
+          <w:numId w:val="21"/>
+        </w:numPr>
+        <w:tabs>
+          <w:tab w:val="clear" w:pos="720"/>
+          <w:tab w:val="num" w:pos="1440"/>
+        </w:tabs>
+        <w:ind w:left="1440"/>
+        <w:rPr>
+          <w:rFonts w:cstheme="minorHAnsi"/>
+        </w:rPr>
+      </w:pPr>
+      <w:r>
+        <w:rPr>
+          <w:rFonts w:cstheme="minorHAnsi"/>
+          <w:b/>
+          <w:bCs/>
+        </w:rPr>
+        <w:t>Sprint Review</w:t>
+      </w:r>
+      <w:r>
+        <w:rPr>
+          <w:rFonts w:cstheme="minorHAnsi"/>
+        </w:rPr>
+        <w:t xml:space="preserve"> – The team presents the completed work to stakeholders.</w:t>
+      </w:r>
+    </w:p>
+    <w:p>
+      <w:pPr>
+        <w:pStyle w:val="NormalWeb"/>
+        <w:numPr>
+          <w:ilvl w:val="0"/>
+          <w:numId w:val="21"/>
+        </w:numPr>
+        <w:tabs>
+          <w:tab w:val="clear" w:pos="720"/>
+          <w:tab w:val="num" w:pos="1440"/>
+        </w:tabs>
+        <w:ind w:left="1440"/>
+        <w:rPr>
+          <w:rFonts w:cstheme="minorHAnsi"/>
+        </w:rPr>
+      </w:pPr>
+      <w:r>
+        <w:rPr>
+          <w:rFonts w:cstheme="minorHAnsi"/>
+          <w:b/>
+          <w:bCs/>
+        </w:rPr>
+        <w:t>Sprint Retrospective</w:t>
+      </w:r>
+      <w:r>
+        <w:rPr>
+          <w:rFonts w:cstheme="minorHAnsi"/>
+        </w:rPr>
+        <w:t xml:space="preserve"> – The team discusses improvements for the next sprint.</w:t>
+      </w:r>
+    </w:p>
+    <w:p>
+      <w:pPr>
+        <w:pStyle w:val="NormalWeb"/>
+        <w:ind w:left="720"/>
+        <w:rPr>
+          <w:rFonts w:cstheme="minorHAnsi"/>
+          <w:b/>
+          <w:bCs/>
+        </w:rPr>
+      </w:pPr>
+      <w:r>
+        <w:rPr>
+          <w:rFonts w:cstheme="minorHAnsi"/>
+          <w:b/>
+          <w:bCs/>
+        </w:rPr>
+        <w:t>4. Self-Organizing Teams</w:t>
+      </w:r>
+    </w:p>
+    <w:p>
+      <w:pPr>
+        <w:pStyle w:val="NormalWeb"/>
+        <w:ind w:left="720"/>
+        <w:rPr>
+          <w:rFonts w:cstheme="minorHAnsi"/>
+        </w:rPr>
+      </w:pPr>
+      <w:r>
+        <w:rPr>
+          <w:rFonts w:cstheme="minorHAnsi"/>
+        </w:rPr>
+        <w:t xml:space="preserve">In Scrum, teams are </w:t>
+      </w:r>
+      <w:r>
+        <w:rPr>
+          <w:rFonts w:cstheme="minorHAnsi"/>
+          <w:b/>
+          <w:bCs/>
+        </w:rPr>
+        <w:t>self-organizing</w:t>
+      </w:r>
+      <w:r>
+        <w:rPr>
+          <w:rFonts w:cstheme="minorHAnsi"/>
+        </w:rPr>
+        <w:t>, meaning they decide how to complete their work.</w:t>
+      </w:r>
+      <w:r>
+        <w:rPr>
+          <w:rFonts w:cstheme="minorHAnsi"/>
+        </w:rPr>
+        <w:br/>
+        <w:t xml:space="preserve">This improves </w:t>
+      </w:r>
+      <w:r>
+        <w:rPr>
+          <w:rFonts w:cstheme="minorHAnsi"/>
+          <w:b/>
+          <w:bCs/>
+        </w:rPr>
+        <w:t>collaboration, responsibility, innovation, and productivity</w:t>
+      </w:r>
+      <w:r>
+        <w:rPr>
+          <w:rFonts w:cstheme="minorHAnsi"/>
+        </w:rPr>
+        <w:t>.</w:t>
+      </w:r>
+    </w:p>
+    <w:p>
+      <w:pPr>
+        <w:pStyle w:val="NormalWeb"/>
+        <w:rPr>
+          <w:sz w:val="20"/>
+          <w:szCs w:val="20"/>
+        </w:rPr>
+      </w:pPr>
+      <w:r>
+        <w:rPr>
+          <w:rStyle w:val="Strong"/>
+          <w:sz w:val="26"/>
+          <w:szCs w:val="26"/>
+        </w:rPr>
+        <w:t>Advantages of Scru</w:t>
+      </w:r>
+      <w:r>
+        <w:rPr>
+          <w:rStyle w:val="Strong"/>
+          <w:sz w:val="26"/>
+          <w:szCs w:val="26"/>
+        </w:rPr>
+        <w:t>m</w:t>
+      </w:r>
+    </w:p>
+    <w:p>
+      <w:pPr>
+        <w:pStyle w:val="NormalWeb"/>
+        <w:numPr>
+          <w:ilvl w:val="0"/>
+          <w:numId w:val="10"/>
+        </w:numPr>
+      </w:pPr>
+      <w:r>
+        <w:t>Fast and continuous delivery</w:t>
+      </w:r>
+    </w:p>
+    <w:p>
+      <w:pPr>
+        <w:pStyle w:val="NormalWeb"/>
+        <w:numPr>
+          <w:ilvl w:val="0"/>
+          <w:numId w:val="10"/>
+        </w:numPr>
+      </w:pPr>
+      <w:r>
+        <w:t>Easy to manage changing requirements</w:t>
+      </w:r>
+    </w:p>
+    <w:p>
+      <w:pPr>
+        <w:pStyle w:val="NormalWeb"/>
+        <w:numPr>
+          <w:ilvl w:val="0"/>
+          <w:numId w:val="10"/>
+        </w:numPr>
+      </w:pPr>
+      <w:r>
+        <w:t>Early customer feedback</w:t>
+      </w:r>
+    </w:p>
+    <w:p>
+      <w:pPr>
+        <w:pStyle w:val="NormalWeb"/>
+        <w:numPr>
+          <w:ilvl w:val="0"/>
+          <w:numId w:val="10"/>
+        </w:numPr>
+      </w:pPr>
+      <w:r>
+        <w:t>Strong team collaboration</w:t>
+      </w:r>
+    </w:p>
+    <w:p>
+      <w:pPr>
+        <w:rPr>
+          <w:rFonts w:ascii="Times New Roman" w:hAnsi="Times New Roman" w:cs="Times New Roman"/>
+          <w:sz w:val="26"/>
+          <w:szCs w:val="26"/>
+        </w:rPr>
+      </w:pPr>
+      <w:r>
+        <w:rPr>
+          <w:rStyle w:val="Strong"/>
+          <w:rFonts w:ascii="Times New Roman" w:hAnsi="Times New Roman" w:cs="Times New Roman"/>
+          <w:sz w:val="26"/>
+          <w:szCs w:val="26"/>
+        </w:rPr>
+        <w:t>When to Use Scru</w:t>
+      </w:r>
+      <w:r>
+        <w:rPr>
+          <w:rStyle w:val="Strong"/>
+          <w:rFonts w:ascii="Times New Roman" w:hAnsi="Times New Roman" w:cs="Times New Roman"/>
+          <w:sz w:val="26"/>
+          <w:szCs w:val="26"/>
+        </w:rPr>
+        <w:t>m</w:t>
+      </w:r>
+    </w:p>
+    <w:p>
+      <w:pPr>
+        <w:pStyle w:val="NormalWeb"/>
+        <w:numPr>
+          <w:ilvl w:val="0"/>
+          <w:numId w:val="11"/>
+        </w:numPr>
+      </w:pPr>
+      <w:r>
+        <w:t>When requirements are not clearly defined</w:t>
+      </w:r>
+    </w:p>
+    <w:p>
+      <w:pPr>
+        <w:pStyle w:val="NormalWeb"/>
+        <w:numPr>
+          <w:ilvl w:val="0"/>
+          <w:numId w:val="11"/>
+        </w:numPr>
+      </w:pPr>
+      <w:r>
+        <w:t>When frequent changes are expected</w:t>
+      </w:r>
+    </w:p>
+    <w:p>
+      <w:pPr>
+        <w:pStyle w:val="NormalWeb"/>
+        <w:numPr>
+          <w:ilvl w:val="0"/>
+          <w:numId w:val="11"/>
+        </w:numPr>
+      </w:pPr>
+      <w:r>
+        <w:t>For complex and dynamic projects</w:t>
+      </w:r>
+    </w:p>
+    <w:p>
+      <w:r>
+        <w:rPr>
+          <w:rFonts w:cstheme="minorHAnsi"/>
+        </w:rPr>
+        <w:pict w14:anchorId="31B72637">
+          <v:rect id="_x0000_i1045" style="width:0;height:1.5pt" o:hralign="center" o:hrstd="t" o:hr="t" fillcolor="#a0a0a0" stroked="f"/>
+        </w:pict>
       </w:r>
     </w:p>
     <w:p>
@@ -2452,6 +3530,7 @@
           <w:b w:val="0"/>
           <w:bCs w:val="0"/>
         </w:rPr>
+        <w:lastRenderedPageBreak/>
         <w:t>Definition:</w:t>
       </w:r>
     </w:p>
@@ -2492,8 +3571,8 @@
     </w:p>
     <w:p>
       <w:r>
-        <w:pict w14:anchorId="10493778">
-          <v:rect id="_x0000_i1026" style="width:0;height:1.5pt" o:hralign="center" o:hrstd="t" o:hr="t" fillcolor="#a0a0a0" stroked="f"/>
+        <w:pict w14:anchorId="5A41DF39">
+          <v:rect id="_x0000_i1044" style="width:0;height:1.5pt" o:hralign="center" o:hrstd="t" o:hr="t" fillcolor="#a0a0a0" stroked="f"/>
         </w:pict>
       </w:r>
     </w:p>
@@ -2869,16 +3948,6 @@
     </w:p>
     <w:p>
       <w:pPr>
-        <w:pStyle w:val="NormalWeb"/>
-        <w:spacing w:after="0" w:afterAutospacing="0"/>
-        <w:rPr>
-          <w:sz w:val="16"/>
-          <w:szCs w:val="16"/>
-        </w:rPr>
-      </w:pPr>
-    </w:p>
-    <w:p>
-      <w:pPr>
         <w:rPr>
           <w:sz w:val="28"/>
           <w:szCs w:val="28"/>
@@ -2910,7 +3979,6 @@
         </w:numPr>
       </w:pPr>
       <w:r>
-        <w:lastRenderedPageBreak/>
         <w:t>Fast development</w:t>
       </w:r>
     </w:p>
@@ -2950,7 +4018,6 @@
         <w:t>Easily adapts to changing requirements</w:t>
       </w:r>
     </w:p>
-    <w:p/>
     <w:p>
       <w:pPr>
         <w:rPr>
@@ -3059,862 +4126,6 @@
       </w:pPr>
       <w:r>
         <w:t>When customer involvement is possible</w:t>
-      </w:r>
-    </w:p>
-    <w:p>
-      <w:r>
-        <w:pict w14:anchorId="6064D9CC">
-          <v:rect id="_x0000_i1027" style="width:0;height:1.5pt" o:hralign="center" o:hrstd="t" o:hr="t" fillcolor="#a0a0a0" stroked="f"/>
-        </w:pict>
-      </w:r>
-    </w:p>
-    <w:p>
-      <w:pPr>
-        <w:pStyle w:val="Heading3"/>
-      </w:pPr>
-      <w:r>
-        <w:rPr>
-          <w:rFonts w:ascii="Segoe UI Symbol" w:hAnsi="Segoe UI Symbol" w:cs="Segoe UI Symbol"/>
-        </w:rPr>
-        <w:t>⭐</w:t>
-      </w:r>
-      <w:r>
-        <w:t xml:space="preserve"> </w:t>
-      </w:r>
-      <w:r>
-        <w:rPr>
-          <w:rStyle w:val="Strong"/>
-          <w:b w:val="0"/>
-          <w:bCs w:val="0"/>
-        </w:rPr>
-        <w:t>One-Line Conclusion (Very Important for Exams):</w:t>
-      </w:r>
-    </w:p>
-    <w:p>
-      <w:pPr>
-        <w:pStyle w:val="NormalWeb"/>
-      </w:pPr>
-      <w:r>
-        <w:t xml:space="preserve">Extreme Programming is an Agile methodology that emphasizes </w:t>
-      </w:r>
-      <w:r>
-        <w:rPr>
-          <w:rStyle w:val="Strong"/>
-        </w:rPr>
-        <w:t>simplicity, continuous feedback, and customer collaboration</w:t>
-      </w:r>
-      <w:r>
-        <w:t xml:space="preserve"> to deliver </w:t>
-      </w:r>
-      <w:r>
-        <w:rPr>
-          <w:rStyle w:val="Strong"/>
-        </w:rPr>
-        <w:t>high-quality software quickly</w:t>
-      </w:r>
-      <w:r>
-        <w:t>.</w:t>
-      </w:r>
-    </w:p>
-    <w:p>
-      <w:pPr>
-        <w:pStyle w:val="Heading2"/>
-      </w:pPr>
-      <w:r>
-        <w:rPr>
-          <w:rStyle w:val="Strong"/>
-          <w:b w:val="0"/>
-          <w:bCs w:val="0"/>
-        </w:rPr>
-        <w:t>Scrum Process</w:t>
-      </w:r>
-    </w:p>
-    <w:p>
-      <w:pPr>
-        <w:pStyle w:val="NormalWeb"/>
-        <w:numPr>
-          <w:ilvl w:val="0"/>
-          <w:numId w:val="7"/>
-        </w:numPr>
-      </w:pPr>
-      <w:r>
-        <w:rPr>
-          <w:rStyle w:val="Strong"/>
-        </w:rPr>
-        <w:t>Product Backlog</w:t>
-      </w:r>
-      <w:r>
-        <w:br/>
-        <w:t>A prioritized list of all requirements and features.</w:t>
-      </w:r>
-    </w:p>
-    <w:p>
-      <w:pPr>
-        <w:pStyle w:val="NormalWeb"/>
-        <w:numPr>
-          <w:ilvl w:val="0"/>
-          <w:numId w:val="7"/>
-        </w:numPr>
-      </w:pPr>
-      <w:r>
-        <w:rPr>
-          <w:rStyle w:val="Strong"/>
-        </w:rPr>
-        <w:t>Sprint Planning</w:t>
-      </w:r>
-      <w:r>
-        <w:br/>
-        <w:t>The team selects items from the product backlog to work on in the current sprint (usually 2–4 weeks).</w:t>
-      </w:r>
-    </w:p>
-    <w:p>
-      <w:pPr>
-        <w:pStyle w:val="NormalWeb"/>
-        <w:numPr>
-          <w:ilvl w:val="0"/>
-          <w:numId w:val="7"/>
-        </w:numPr>
-      </w:pPr>
-      <w:r>
-        <w:rPr>
-          <w:rStyle w:val="Strong"/>
-        </w:rPr>
-        <w:t>Sprint (Development Phase)</w:t>
-      </w:r>
-      <w:r>
-        <w:br/>
-        <w:t>Actual design, coding, and testing are done.</w:t>
-      </w:r>
-      <w:r>
-        <w:br/>
-        <w:t xml:space="preserve">A </w:t>
-      </w:r>
-      <w:r>
-        <w:rPr>
-          <w:rStyle w:val="Strong"/>
-        </w:rPr>
-        <w:t>Daily Scrum</w:t>
-      </w:r>
-      <w:r>
-        <w:t xml:space="preserve"> (15-minute meeting) is conducted to track progress.</w:t>
-      </w:r>
-    </w:p>
-    <w:p>
-      <w:pPr>
-        <w:pStyle w:val="NormalWeb"/>
-        <w:numPr>
-          <w:ilvl w:val="0"/>
-          <w:numId w:val="7"/>
-        </w:numPr>
-      </w:pPr>
-      <w:r>
-        <w:rPr>
-          <w:rStyle w:val="Strong"/>
-        </w:rPr>
-        <w:t>Sprint Review</w:t>
-      </w:r>
-      <w:r>
-        <w:br/>
-        <w:t>At the end of the sprint, the developed product is demonstrated to stakeholders.</w:t>
-      </w:r>
-    </w:p>
-    <w:p>
-      <w:pPr>
-        <w:pStyle w:val="NormalWeb"/>
-        <w:numPr>
-          <w:ilvl w:val="0"/>
-          <w:numId w:val="7"/>
-        </w:numPr>
-      </w:pPr>
-      <w:r>
-        <w:rPr>
-          <w:rStyle w:val="Strong"/>
-        </w:rPr>
-        <w:t>Sprint Retrospective</w:t>
-      </w:r>
-      <w:r>
-        <w:br/>
-        <w:t>The team discusses what went well, what problems occurred, and how to improve in the next sprint.</w:t>
-      </w:r>
-    </w:p>
-    <w:p>
-      <w:pPr>
-        <w:pStyle w:val="NormalWeb"/>
-      </w:pPr>
-      <w:r>
-        <w:rPr>
-          <w:rFonts w:ascii="Segoe UI Symbol" w:hAnsi="Segoe UI Symbol" w:cs="Segoe UI Symbol"/>
-        </w:rPr>
-        <w:t>👉</w:t>
-      </w:r>
-      <w:r>
-        <w:t xml:space="preserve"> The cycle then repeats for the next sprint.</w:t>
-      </w:r>
-    </w:p>
-    <w:p>
-      <w:r>
-        <w:pict w14:anchorId="1804473F">
-          <v:rect id="_x0000_i1028" style="width:0;height:1.5pt" o:hralign="center" o:hrstd="t" o:hr="t" fillcolor="#a0a0a0" stroked="f"/>
-        </w:pict>
-      </w:r>
-    </w:p>
-    <w:p>
-      <w:pPr>
-        <w:pStyle w:val="Heading2"/>
-      </w:pPr>
-      <w:r>
-        <w:rPr>
-          <w:rFonts w:ascii="Segoe UI Symbol" w:hAnsi="Segoe UI Symbol" w:cs="Segoe UI Symbol"/>
-        </w:rPr>
-        <w:t>🔹</w:t>
-      </w:r>
-      <w:r>
-        <w:t xml:space="preserve"> </w:t>
-      </w:r>
-      <w:r>
-        <w:rPr>
-          <w:rStyle w:val="Strong"/>
-          <w:b w:val="0"/>
-          <w:bCs w:val="0"/>
-        </w:rPr>
-        <w:t>Scrum Roles</w:t>
-      </w:r>
-    </w:p>
-    <w:p>
-      <w:pPr>
-        <w:pStyle w:val="NormalWeb"/>
-        <w:numPr>
-          <w:ilvl w:val="0"/>
-          <w:numId w:val="8"/>
-        </w:numPr>
-      </w:pPr>
-      <w:r>
-        <w:rPr>
-          <w:rStyle w:val="Strong"/>
-        </w:rPr>
-        <w:t>Product Owner</w:t>
-      </w:r>
-      <w:r>
-        <w:t xml:space="preserve"> – Defines requirements and sets priorities</w:t>
-      </w:r>
-    </w:p>
-    <w:p>
-      <w:pPr>
-        <w:pStyle w:val="NormalWeb"/>
-        <w:numPr>
-          <w:ilvl w:val="0"/>
-          <w:numId w:val="8"/>
-        </w:numPr>
-      </w:pPr>
-      <w:r>
-        <w:rPr>
-          <w:rStyle w:val="Strong"/>
-        </w:rPr>
-        <w:t>Scrum Master</w:t>
-      </w:r>
-      <w:r>
-        <w:t xml:space="preserve"> – Facilitates the process and removes obstacles</w:t>
-      </w:r>
-    </w:p>
-    <w:p>
-      <w:pPr>
-        <w:pStyle w:val="NormalWeb"/>
-        <w:numPr>
-          <w:ilvl w:val="0"/>
-          <w:numId w:val="8"/>
-        </w:numPr>
-      </w:pPr>
-      <w:r>
-        <w:rPr>
-          <w:rStyle w:val="Strong"/>
-        </w:rPr>
-        <w:lastRenderedPageBreak/>
-        <w:t>Development Team</w:t>
-      </w:r>
-      <w:r>
-        <w:t xml:space="preserve"> – Develops, tests, and delivers the product</w:t>
-      </w:r>
-    </w:p>
-    <w:p>
-      <w:r>
-        <w:pict w14:anchorId="772DF115">
-          <v:rect id="_x0000_i1029" style="width:0;height:1.5pt" o:hralign="center" o:hrstd="t" o:hr="t" fillcolor="#a0a0a0" stroked="f"/>
-        </w:pict>
-      </w:r>
-    </w:p>
-    <w:p>
-      <w:pPr>
-        <w:pStyle w:val="Heading2"/>
-      </w:pPr>
-      <w:r>
-        <w:rPr>
-          <w:rFonts w:ascii="Segoe UI Symbol" w:hAnsi="Segoe UI Symbol" w:cs="Segoe UI Symbol"/>
-        </w:rPr>
-        <w:t>🔹</w:t>
-      </w:r>
-      <w:r>
-        <w:t xml:space="preserve"> </w:t>
-      </w:r>
-      <w:r>
-        <w:rPr>
-          <w:rStyle w:val="Strong"/>
-          <w:b w:val="0"/>
-          <w:bCs w:val="0"/>
-        </w:rPr>
-        <w:t>Scrum Artifacts</w:t>
-      </w:r>
-    </w:p>
-    <w:p>
-      <w:pPr>
-        <w:pStyle w:val="NormalWeb"/>
-        <w:numPr>
-          <w:ilvl w:val="0"/>
-          <w:numId w:val="9"/>
-        </w:numPr>
-      </w:pPr>
-      <w:r>
-        <w:t>Product Backlog</w:t>
-      </w:r>
-    </w:p>
-    <w:p>
-      <w:pPr>
-        <w:pStyle w:val="NormalWeb"/>
-        <w:numPr>
-          <w:ilvl w:val="0"/>
-          <w:numId w:val="9"/>
-        </w:numPr>
-      </w:pPr>
-      <w:r>
-        <w:t>Sprint Backlog</w:t>
-      </w:r>
-    </w:p>
-    <w:p>
-      <w:pPr>
-        <w:pStyle w:val="NormalWeb"/>
-        <w:numPr>
-          <w:ilvl w:val="0"/>
-          <w:numId w:val="9"/>
-        </w:numPr>
-      </w:pPr>
-      <w:r>
-        <w:t>Increment (working product at the end of each sprint)</w:t>
-      </w:r>
-    </w:p>
-    <w:p>
-      <w:r>
-        <w:pict w14:anchorId="3886B17C">
-          <v:rect id="_x0000_i1030" style="width:0;height:1.5pt" o:hralign="center" o:hrstd="t" o:hr="t" fillcolor="#a0a0a0" stroked="f"/>
-        </w:pict>
-      </w:r>
-    </w:p>
-    <w:p>
-      <w:pPr>
-        <w:pStyle w:val="Heading2"/>
-      </w:pPr>
-      <w:r>
-        <w:rPr>
-          <w:rFonts w:ascii="Segoe UI Symbol" w:hAnsi="Segoe UI Symbol" w:cs="Segoe UI Symbol"/>
-        </w:rPr>
-        <w:t>🔹</w:t>
-      </w:r>
-      <w:r>
-        <w:t xml:space="preserve"> </w:t>
-      </w:r>
-      <w:r>
-        <w:rPr>
-          <w:rStyle w:val="Strong"/>
-          <w:b w:val="0"/>
-          <w:bCs w:val="0"/>
-        </w:rPr>
-        <w:t>Advantages of Scrum</w:t>
-      </w:r>
-    </w:p>
-    <w:p>
-      <w:pPr>
-        <w:pStyle w:val="NormalWeb"/>
-        <w:numPr>
-          <w:ilvl w:val="0"/>
-          <w:numId w:val="10"/>
-        </w:numPr>
-      </w:pPr>
-      <w:r>
-        <w:t>Fast and continuous delivery</w:t>
-      </w:r>
-    </w:p>
-    <w:p>
-      <w:pPr>
-        <w:pStyle w:val="NormalWeb"/>
-        <w:numPr>
-          <w:ilvl w:val="0"/>
-          <w:numId w:val="10"/>
-        </w:numPr>
-      </w:pPr>
-      <w:r>
-        <w:t>Easy to manage changing requirements</w:t>
-      </w:r>
-    </w:p>
-    <w:p>
-      <w:pPr>
-        <w:pStyle w:val="NormalWeb"/>
-        <w:numPr>
-          <w:ilvl w:val="0"/>
-          <w:numId w:val="10"/>
-        </w:numPr>
-      </w:pPr>
-      <w:r>
-        <w:t>Early customer feedback</w:t>
-      </w:r>
-    </w:p>
-    <w:p>
-      <w:pPr>
-        <w:pStyle w:val="NormalWeb"/>
-        <w:numPr>
-          <w:ilvl w:val="0"/>
-          <w:numId w:val="10"/>
-        </w:numPr>
-      </w:pPr>
-      <w:r>
-        <w:t>Strong team collaboration</w:t>
-      </w:r>
-    </w:p>
-    <w:p>
-      <w:r>
-        <w:pict w14:anchorId="2253A975">
-          <v:rect id="_x0000_i1031" style="width:0;height:1.5pt" o:hralign="center" o:hrstd="t" o:hr="t" fillcolor="#a0a0a0" stroked="f"/>
-        </w:pict>
-      </w:r>
-    </w:p>
-    <w:p>
-      <w:pPr>
-        <w:pStyle w:val="Heading2"/>
-      </w:pPr>
-      <w:r>
-        <w:rPr>
-          <w:rFonts w:ascii="Segoe UI Symbol" w:hAnsi="Segoe UI Symbol" w:cs="Segoe UI Symbol"/>
-        </w:rPr>
-        <w:t>🔹</w:t>
-      </w:r>
-      <w:r>
-        <w:t xml:space="preserve"> </w:t>
-      </w:r>
-      <w:r>
-        <w:rPr>
-          <w:rStyle w:val="Strong"/>
-          <w:b w:val="0"/>
-          <w:bCs w:val="0"/>
-        </w:rPr>
-        <w:t>When to Use Scrum</w:t>
-      </w:r>
-    </w:p>
-    <w:p>
-      <w:pPr>
-        <w:pStyle w:val="NormalWeb"/>
-        <w:numPr>
-          <w:ilvl w:val="0"/>
-          <w:numId w:val="11"/>
-        </w:numPr>
-      </w:pPr>
-      <w:r>
-        <w:t>When requirements are not clearly defined</w:t>
-      </w:r>
-    </w:p>
-    <w:p>
-      <w:pPr>
-        <w:pStyle w:val="NormalWeb"/>
-        <w:numPr>
-          <w:ilvl w:val="0"/>
-          <w:numId w:val="11"/>
-        </w:numPr>
-      </w:pPr>
-      <w:r>
-        <w:t>When frequent changes are expected</w:t>
-      </w:r>
-    </w:p>
-    <w:p>
-      <w:pPr>
-        <w:pStyle w:val="NormalWeb"/>
-        <w:numPr>
-          <w:ilvl w:val="0"/>
-          <w:numId w:val="11"/>
-        </w:numPr>
-      </w:pPr>
-      <w:r>
-        <w:t>For complex and dynamic projects</w:t>
-      </w:r>
-    </w:p>
-    <w:p>
-      <w:pPr>
-        <w:pStyle w:val="Heading2"/>
-      </w:pPr>
-      <w:r>
-        <w:rPr>
-          <w:rStyle w:val="Strong"/>
-          <w:b w:val="0"/>
-          <w:bCs w:val="0"/>
-        </w:rPr>
-        <w:t>Agile Manifesto</w:t>
-      </w:r>
-    </w:p>
-    <w:p>
-      <w:pPr>
-        <w:pStyle w:val="NormalWeb"/>
-      </w:pPr>
-      <w:r>
-        <w:t xml:space="preserve">The </w:t>
-      </w:r>
-      <w:r>
-        <w:rPr>
-          <w:rStyle w:val="Strong"/>
-        </w:rPr>
-        <w:t>Agile Manifesto</w:t>
-      </w:r>
-      <w:r>
-        <w:t xml:space="preserve"> was introduced in </w:t>
-      </w:r>
-      <w:r>
-        <w:rPr>
-          <w:rStyle w:val="Strong"/>
-        </w:rPr>
-        <w:t>2001</w:t>
-      </w:r>
-      <w:r>
-        <w:t xml:space="preserve"> to improve software development by focusing on flexibility, collaboration, and customer satisfaction.</w:t>
-      </w:r>
-    </w:p>
-    <w:p>
-      <w:pPr>
-        <w:pStyle w:val="Heading3"/>
-      </w:pPr>
-      <w:r>
-        <w:rPr>
-          <w:rStyle w:val="Strong"/>
-          <w:b w:val="0"/>
-          <w:bCs w:val="0"/>
-        </w:rPr>
-        <w:t>Four Core Values of Agile</w:t>
-      </w:r>
-    </w:p>
-    <w:p>
-      <w:pPr>
-        <w:pStyle w:val="NormalWeb"/>
-        <w:numPr>
-          <w:ilvl w:val="0"/>
-          <w:numId w:val="12"/>
-        </w:numPr>
-      </w:pPr>
-      <w:r>
-        <w:rPr>
-          <w:rStyle w:val="Strong"/>
-        </w:rPr>
-        <w:t>Individuals and interactions</w:t>
-      </w:r>
-      <w:r>
-        <w:t xml:space="preserve"> over processes and tools</w:t>
-      </w:r>
-    </w:p>
-    <w:p>
-      <w:pPr>
-        <w:pStyle w:val="NormalWeb"/>
-        <w:numPr>
-          <w:ilvl w:val="0"/>
-          <w:numId w:val="12"/>
-        </w:numPr>
-      </w:pPr>
-      <w:r>
-        <w:rPr>
-          <w:rStyle w:val="Strong"/>
-        </w:rPr>
-        <w:t>Working software</w:t>
-      </w:r>
-      <w:r>
-        <w:t xml:space="preserve"> over comprehensive documentation</w:t>
-      </w:r>
-    </w:p>
-    <w:p>
-      <w:pPr>
-        <w:pStyle w:val="NormalWeb"/>
-        <w:numPr>
-          <w:ilvl w:val="0"/>
-          <w:numId w:val="12"/>
-        </w:numPr>
-      </w:pPr>
-      <w:r>
-        <w:rPr>
-          <w:rStyle w:val="Strong"/>
-        </w:rPr>
-        <w:t>Customer collaboration</w:t>
-      </w:r>
-      <w:r>
-        <w:t xml:space="preserve"> over contract negotiation</w:t>
-      </w:r>
-    </w:p>
-    <w:p>
-      <w:pPr>
-        <w:pStyle w:val="NormalWeb"/>
-        <w:numPr>
-          <w:ilvl w:val="0"/>
-          <w:numId w:val="12"/>
-        </w:numPr>
-      </w:pPr>
-      <w:r>
-        <w:rPr>
-          <w:rStyle w:val="Strong"/>
-        </w:rPr>
-        <w:t>Responding to change</w:t>
-      </w:r>
-      <w:r>
-        <w:t xml:space="preserve"> over following a plan</w:t>
-      </w:r>
-    </w:p>
-    <w:p>
-      <w:pPr>
-        <w:pStyle w:val="NormalWeb"/>
-      </w:pPr>
-      <w:r>
-        <w:rPr>
-          <w:rFonts w:ascii="Segoe UI Symbol" w:hAnsi="Segoe UI Symbol" w:cs="Segoe UI Symbol"/>
-        </w:rPr>
-        <w:t>👉</w:t>
-      </w:r>
-      <w:r>
-        <w:t xml:space="preserve"> This means: while items on the right are important, items on the left are valued more.</w:t>
-      </w:r>
-    </w:p>
-    <w:p>
-      <w:r>
-        <w:pict w14:anchorId="7E98A4F3">
-          <v:rect id="_x0000_i1032" style="width:0;height:1.5pt" o:hralign="center" o:hrstd="t" o:hr="t" fillcolor="#a0a0a0" stroked="f"/>
-        </w:pict>
-      </w:r>
-    </w:p>
-    <w:p>
-      <w:pPr>
-        <w:pStyle w:val="Heading2"/>
-      </w:pPr>
-      <w:r>
-        <w:rPr>
-          <w:rStyle w:val="Strong"/>
-          <w:b w:val="0"/>
-          <w:bCs w:val="0"/>
-        </w:rPr>
-        <w:t>12 Principles of Agile Software Development</w:t>
-      </w:r>
-    </w:p>
-    <w:p>
-      <w:pPr>
-        <w:pStyle w:val="NormalWeb"/>
-        <w:numPr>
-          <w:ilvl w:val="0"/>
-          <w:numId w:val="13"/>
-        </w:numPr>
-      </w:pPr>
-      <w:r>
-        <w:rPr>
-          <w:rStyle w:val="Strong"/>
-        </w:rPr>
-        <w:t>Customer satisfaction</w:t>
-      </w:r>
-      <w:r>
-        <w:t xml:space="preserve"> through early and continuous delivery of valuable software.</w:t>
-      </w:r>
-    </w:p>
-    <w:p>
-      <w:pPr>
-        <w:pStyle w:val="NormalWeb"/>
-        <w:numPr>
-          <w:ilvl w:val="0"/>
-          <w:numId w:val="13"/>
-        </w:numPr>
-      </w:pPr>
-      <w:r>
-        <w:rPr>
-          <w:rStyle w:val="Strong"/>
-        </w:rPr>
-        <w:t>Welcome changing requirements</w:t>
-      </w:r>
-      <w:r>
-        <w:t>, even late in development, for the customer’s competitive advantage.</w:t>
-      </w:r>
-    </w:p>
-    <w:p>
-      <w:pPr>
-        <w:pStyle w:val="NormalWeb"/>
-        <w:numPr>
-          <w:ilvl w:val="0"/>
-          <w:numId w:val="13"/>
-        </w:numPr>
-      </w:pPr>
-      <w:r>
-        <w:rPr>
-          <w:rStyle w:val="Strong"/>
-        </w:rPr>
-        <w:lastRenderedPageBreak/>
-        <w:t>Deliver working software frequently</w:t>
-      </w:r>
-      <w:r>
-        <w:t>, from a few weeks to a few months, with a preference for shorter timescales.</w:t>
-      </w:r>
-    </w:p>
-    <w:p>
-      <w:pPr>
-        <w:pStyle w:val="NormalWeb"/>
-        <w:numPr>
-          <w:ilvl w:val="0"/>
-          <w:numId w:val="13"/>
-        </w:numPr>
-      </w:pPr>
-      <w:r>
-        <w:rPr>
-          <w:rStyle w:val="Strong"/>
-        </w:rPr>
-        <w:t>Business people and developers must work together daily</w:t>
-      </w:r>
-      <w:r>
-        <w:t xml:space="preserve"> throughout the project.</w:t>
-      </w:r>
-    </w:p>
-    <w:p>
-      <w:pPr>
-        <w:pStyle w:val="NormalWeb"/>
-        <w:numPr>
-          <w:ilvl w:val="0"/>
-          <w:numId w:val="13"/>
-        </w:numPr>
-      </w:pPr>
-      <w:r>
-        <w:rPr>
-          <w:rStyle w:val="Strong"/>
-        </w:rPr>
-        <w:t>Build projects around motivated individuals</w:t>
-      </w:r>
-      <w:r>
-        <w:t>, give them the environment and support they need, and trust them to get the job done.</w:t>
-      </w:r>
-    </w:p>
-    <w:p>
-      <w:pPr>
-        <w:pStyle w:val="NormalWeb"/>
-        <w:numPr>
-          <w:ilvl w:val="0"/>
-          <w:numId w:val="13"/>
-        </w:numPr>
-      </w:pPr>
-      <w:r>
-        <w:rPr>
-          <w:rStyle w:val="Strong"/>
-        </w:rPr>
-        <w:t>Face-to-face conversation</w:t>
-      </w:r>
-      <w:r>
-        <w:t xml:space="preserve"> is the most effective and efficient method of conveying information.</w:t>
-      </w:r>
-    </w:p>
-    <w:p>
-      <w:pPr>
-        <w:pStyle w:val="NormalWeb"/>
-        <w:numPr>
-          <w:ilvl w:val="0"/>
-          <w:numId w:val="13"/>
-        </w:numPr>
-      </w:pPr>
-      <w:r>
-        <w:rPr>
-          <w:rStyle w:val="Strong"/>
-        </w:rPr>
-        <w:t>Working software is the primary measure of progress.</w:t>
-      </w:r>
-    </w:p>
-    <w:p>
-      <w:pPr>
-        <w:pStyle w:val="NormalWeb"/>
-        <w:numPr>
-          <w:ilvl w:val="0"/>
-          <w:numId w:val="13"/>
-        </w:numPr>
-      </w:pPr>
-      <w:r>
-        <w:rPr>
-          <w:rStyle w:val="Strong"/>
-        </w:rPr>
-        <w:t>Agile processes promote sustainable development</w:t>
-      </w:r>
-      <w:r>
-        <w:t xml:space="preserve"> — teams should maintain a constant pace indefinitely.</w:t>
-      </w:r>
-    </w:p>
-    <w:p>
-      <w:pPr>
-        <w:pStyle w:val="NormalWeb"/>
-        <w:numPr>
-          <w:ilvl w:val="0"/>
-          <w:numId w:val="13"/>
-        </w:numPr>
-      </w:pPr>
-      <w:r>
-        <w:rPr>
-          <w:rStyle w:val="Strong"/>
-        </w:rPr>
-        <w:t>Continuous attention to technical excellence and good design</w:t>
-      </w:r>
-      <w:r>
-        <w:t xml:space="preserve"> enhances agility.</w:t>
-      </w:r>
-    </w:p>
-    <w:p>
-      <w:pPr>
-        <w:pStyle w:val="NormalWeb"/>
-        <w:numPr>
-          <w:ilvl w:val="0"/>
-          <w:numId w:val="13"/>
-        </w:numPr>
-      </w:pPr>
-      <w:r>
-        <w:rPr>
-          <w:rStyle w:val="Strong"/>
-        </w:rPr>
-        <w:t>Simplicity</w:t>
-      </w:r>
-      <w:r>
-        <w:t xml:space="preserve"> — the art of maximizing the amount of work not done — is essential.</w:t>
-      </w:r>
-    </w:p>
-    <w:p>
-      <w:pPr>
-        <w:pStyle w:val="NormalWeb"/>
-        <w:numPr>
-          <w:ilvl w:val="0"/>
-          <w:numId w:val="13"/>
-        </w:numPr>
-      </w:pPr>
-      <w:r>
-        <w:rPr>
-          <w:rStyle w:val="Strong"/>
-        </w:rPr>
-        <w:t>The best architectures, requirements, and designs emerge from self-organizing teams.</w:t>
-      </w:r>
-    </w:p>
-    <w:p>
-      <w:pPr>
-        <w:pStyle w:val="NormalWeb"/>
-        <w:numPr>
-          <w:ilvl w:val="0"/>
-          <w:numId w:val="13"/>
-        </w:numPr>
-      </w:pPr>
-      <w:r>
-        <w:rPr>
-          <w:rStyle w:val="Strong"/>
-        </w:rPr>
-        <w:t>At regular intervals, the team reflects</w:t>
-      </w:r>
-      <w:r>
-        <w:t xml:space="preserve"> on how to become more effective and adjusts its </w:t>
-      </w:r>
-      <w:r>
-        <w:t>behaviour</w:t>
-      </w:r>
-      <w:r>
-        <w:t xml:space="preserve"> accordingly.</w:t>
       </w:r>
     </w:p>
     <w:p/>
@@ -5467,6 +5678,304 @@
     </w:lvl>
   </w:abstractNum>
   <w:abstractNum w:abstractNumId="3" w15:restartNumberingAfterBreak="0">
+    <w:nsid w:val="28421A16"/>
+    <w:multiLevelType w:val="multilevel"/>
+    <w:tmpl w:val="C3A65D88"/>
+    <w:lvl w:ilvl="0">
+      <w:start w:val="1"/>
+      <w:numFmt w:val="bullet"/>
+      <w:lvlText w:val=""/>
+      <w:lvlJc w:val="left"/>
+      <w:pPr>
+        <w:tabs>
+          <w:tab w:val="num" w:pos="720"/>
+        </w:tabs>
+        <w:ind w:left="720" w:hanging="360"/>
+      </w:pPr>
+      <w:rPr>
+        <w:rFonts w:ascii="Symbol" w:hAnsi="Symbol" w:hint="default"/>
+        <w:sz w:val="20"/>
+      </w:rPr>
+    </w:lvl>
+    <w:lvl w:ilvl="1" w:tentative="1">
+      <w:start w:val="1"/>
+      <w:numFmt w:val="bullet"/>
+      <w:lvlText w:val="o"/>
+      <w:lvlJc w:val="left"/>
+      <w:pPr>
+        <w:tabs>
+          <w:tab w:val="num" w:pos="1440"/>
+        </w:tabs>
+        <w:ind w:left="1440" w:hanging="360"/>
+      </w:pPr>
+      <w:rPr>
+        <w:rFonts w:ascii="Courier New" w:hAnsi="Courier New" w:hint="default"/>
+        <w:sz w:val="20"/>
+      </w:rPr>
+    </w:lvl>
+    <w:lvl w:ilvl="2" w:tentative="1">
+      <w:start w:val="1"/>
+      <w:numFmt w:val="bullet"/>
+      <w:lvlText w:val=""/>
+      <w:lvlJc w:val="left"/>
+      <w:pPr>
+        <w:tabs>
+          <w:tab w:val="num" w:pos="2160"/>
+        </w:tabs>
+        <w:ind w:left="2160" w:hanging="360"/>
+      </w:pPr>
+      <w:rPr>
+        <w:rFonts w:ascii="Wingdings" w:hAnsi="Wingdings" w:hint="default"/>
+        <w:sz w:val="20"/>
+      </w:rPr>
+    </w:lvl>
+    <w:lvl w:ilvl="3" w:tentative="1">
+      <w:start w:val="1"/>
+      <w:numFmt w:val="bullet"/>
+      <w:lvlText w:val=""/>
+      <w:lvlJc w:val="left"/>
+      <w:pPr>
+        <w:tabs>
+          <w:tab w:val="num" w:pos="2880"/>
+        </w:tabs>
+        <w:ind w:left="2880" w:hanging="360"/>
+      </w:pPr>
+      <w:rPr>
+        <w:rFonts w:ascii="Wingdings" w:hAnsi="Wingdings" w:hint="default"/>
+        <w:sz w:val="20"/>
+      </w:rPr>
+    </w:lvl>
+    <w:lvl w:ilvl="4" w:tentative="1">
+      <w:start w:val="1"/>
+      <w:numFmt w:val="bullet"/>
+      <w:lvlText w:val=""/>
+      <w:lvlJc w:val="left"/>
+      <w:pPr>
+        <w:tabs>
+          <w:tab w:val="num" w:pos="3600"/>
+        </w:tabs>
+        <w:ind w:left="3600" w:hanging="360"/>
+      </w:pPr>
+      <w:rPr>
+        <w:rFonts w:ascii="Wingdings" w:hAnsi="Wingdings" w:hint="default"/>
+        <w:sz w:val="20"/>
+      </w:rPr>
+    </w:lvl>
+    <w:lvl w:ilvl="5" w:tentative="1">
+      <w:start w:val="1"/>
+      <w:numFmt w:val="bullet"/>
+      <w:lvlText w:val=""/>
+      <w:lvlJc w:val="left"/>
+      <w:pPr>
+        <w:tabs>
+          <w:tab w:val="num" w:pos="4320"/>
+        </w:tabs>
+        <w:ind w:left="4320" w:hanging="360"/>
+      </w:pPr>
+      <w:rPr>
+        <w:rFonts w:ascii="Wingdings" w:hAnsi="Wingdings" w:hint="default"/>
+        <w:sz w:val="20"/>
+      </w:rPr>
+    </w:lvl>
+    <w:lvl w:ilvl="6" w:tentative="1">
+      <w:start w:val="1"/>
+      <w:numFmt w:val="bullet"/>
+      <w:lvlText w:val=""/>
+      <w:lvlJc w:val="left"/>
+      <w:pPr>
+        <w:tabs>
+          <w:tab w:val="num" w:pos="5040"/>
+        </w:tabs>
+        <w:ind w:left="5040" w:hanging="360"/>
+      </w:pPr>
+      <w:rPr>
+        <w:rFonts w:ascii="Wingdings" w:hAnsi="Wingdings" w:hint="default"/>
+        <w:sz w:val="20"/>
+      </w:rPr>
+    </w:lvl>
+    <w:lvl w:ilvl="7" w:tentative="1">
+      <w:start w:val="1"/>
+      <w:numFmt w:val="bullet"/>
+      <w:lvlText w:val=""/>
+      <w:lvlJc w:val="left"/>
+      <w:pPr>
+        <w:tabs>
+          <w:tab w:val="num" w:pos="5760"/>
+        </w:tabs>
+        <w:ind w:left="5760" w:hanging="360"/>
+      </w:pPr>
+      <w:rPr>
+        <w:rFonts w:ascii="Wingdings" w:hAnsi="Wingdings" w:hint="default"/>
+        <w:sz w:val="20"/>
+      </w:rPr>
+    </w:lvl>
+    <w:lvl w:ilvl="8" w:tentative="1">
+      <w:start w:val="1"/>
+      <w:numFmt w:val="bullet"/>
+      <w:lvlText w:val=""/>
+      <w:lvlJc w:val="left"/>
+      <w:pPr>
+        <w:tabs>
+          <w:tab w:val="num" w:pos="6480"/>
+        </w:tabs>
+        <w:ind w:left="6480" w:hanging="360"/>
+      </w:pPr>
+      <w:rPr>
+        <w:rFonts w:ascii="Wingdings" w:hAnsi="Wingdings" w:hint="default"/>
+        <w:sz w:val="20"/>
+      </w:rPr>
+    </w:lvl>
+  </w:abstractNum>
+  <w:abstractNum w:abstractNumId="4" w15:restartNumberingAfterBreak="0">
+    <w:nsid w:val="2A4E2201"/>
+    <w:multiLevelType w:val="multilevel"/>
+    <w:tmpl w:val="5D4A6804"/>
+    <w:lvl w:ilvl="0">
+      <w:start w:val="1"/>
+      <w:numFmt w:val="bullet"/>
+      <w:lvlText w:val=""/>
+      <w:lvlJc w:val="left"/>
+      <w:pPr>
+        <w:tabs>
+          <w:tab w:val="num" w:pos="720"/>
+        </w:tabs>
+        <w:ind w:left="720" w:hanging="360"/>
+      </w:pPr>
+      <w:rPr>
+        <w:rFonts w:ascii="Symbol" w:hAnsi="Symbol" w:hint="default"/>
+        <w:sz w:val="20"/>
+      </w:rPr>
+    </w:lvl>
+    <w:lvl w:ilvl="1" w:tentative="1">
+      <w:start w:val="1"/>
+      <w:numFmt w:val="bullet"/>
+      <w:lvlText w:val="o"/>
+      <w:lvlJc w:val="left"/>
+      <w:pPr>
+        <w:tabs>
+          <w:tab w:val="num" w:pos="1440"/>
+        </w:tabs>
+        <w:ind w:left="1440" w:hanging="360"/>
+      </w:pPr>
+      <w:rPr>
+        <w:rFonts w:ascii="Courier New" w:hAnsi="Courier New" w:hint="default"/>
+        <w:sz w:val="20"/>
+      </w:rPr>
+    </w:lvl>
+    <w:lvl w:ilvl="2" w:tentative="1">
+      <w:start w:val="1"/>
+      <w:numFmt w:val="bullet"/>
+      <w:lvlText w:val=""/>
+      <w:lvlJc w:val="left"/>
+      <w:pPr>
+        <w:tabs>
+          <w:tab w:val="num" w:pos="2160"/>
+        </w:tabs>
+        <w:ind w:left="2160" w:hanging="360"/>
+      </w:pPr>
+      <w:rPr>
+        <w:rFonts w:ascii="Wingdings" w:hAnsi="Wingdings" w:hint="default"/>
+        <w:sz w:val="20"/>
+      </w:rPr>
+    </w:lvl>
+    <w:lvl w:ilvl="3" w:tentative="1">
+      <w:start w:val="1"/>
+      <w:numFmt w:val="bullet"/>
+      <w:lvlText w:val=""/>
+      <w:lvlJc w:val="left"/>
+      <w:pPr>
+        <w:tabs>
+          <w:tab w:val="num" w:pos="2880"/>
+        </w:tabs>
+        <w:ind w:left="2880" w:hanging="360"/>
+      </w:pPr>
+      <w:rPr>
+        <w:rFonts w:ascii="Wingdings" w:hAnsi="Wingdings" w:hint="default"/>
+        <w:sz w:val="20"/>
+      </w:rPr>
+    </w:lvl>
+    <w:lvl w:ilvl="4" w:tentative="1">
+      <w:start w:val="1"/>
+      <w:numFmt w:val="bullet"/>
+      <w:lvlText w:val=""/>
+      <w:lvlJc w:val="left"/>
+      <w:pPr>
+        <w:tabs>
+          <w:tab w:val="num" w:pos="3600"/>
+        </w:tabs>
+        <w:ind w:left="3600" w:hanging="360"/>
+      </w:pPr>
+      <w:rPr>
+        <w:rFonts w:ascii="Wingdings" w:hAnsi="Wingdings" w:hint="default"/>
+        <w:sz w:val="20"/>
+      </w:rPr>
+    </w:lvl>
+    <w:lvl w:ilvl="5" w:tentative="1">
+      <w:start w:val="1"/>
+      <w:numFmt w:val="bullet"/>
+      <w:lvlText w:val=""/>
+      <w:lvlJc w:val="left"/>
+      <w:pPr>
+        <w:tabs>
+          <w:tab w:val="num" w:pos="4320"/>
+        </w:tabs>
+        <w:ind w:left="4320" w:hanging="360"/>
+      </w:pPr>
+      <w:rPr>
+        <w:rFonts w:ascii="Wingdings" w:hAnsi="Wingdings" w:hint="default"/>
+        <w:sz w:val="20"/>
+      </w:rPr>
+    </w:lvl>
+    <w:lvl w:ilvl="6" w:tentative="1">
+      <w:start w:val="1"/>
+      <w:numFmt w:val="bullet"/>
+      <w:lvlText w:val=""/>
+      <w:lvlJc w:val="left"/>
+      <w:pPr>
+        <w:tabs>
+          <w:tab w:val="num" w:pos="5040"/>
+        </w:tabs>
+        <w:ind w:left="5040" w:hanging="360"/>
+      </w:pPr>
+      <w:rPr>
+        <w:rFonts w:ascii="Wingdings" w:hAnsi="Wingdings" w:hint="default"/>
+        <w:sz w:val="20"/>
+      </w:rPr>
+    </w:lvl>
+    <w:lvl w:ilvl="7" w:tentative="1">
+      <w:start w:val="1"/>
+      <w:numFmt w:val="bullet"/>
+      <w:lvlText w:val=""/>
+      <w:lvlJc w:val="left"/>
+      <w:pPr>
+        <w:tabs>
+          <w:tab w:val="num" w:pos="5760"/>
+        </w:tabs>
+        <w:ind w:left="5760" w:hanging="360"/>
+      </w:pPr>
+      <w:rPr>
+        <w:rFonts w:ascii="Wingdings" w:hAnsi="Wingdings" w:hint="default"/>
+        <w:sz w:val="20"/>
+      </w:rPr>
+    </w:lvl>
+    <w:lvl w:ilvl="8" w:tentative="1">
+      <w:start w:val="1"/>
+      <w:numFmt w:val="bullet"/>
+      <w:lvlText w:val=""/>
+      <w:lvlJc w:val="left"/>
+      <w:pPr>
+        <w:tabs>
+          <w:tab w:val="num" w:pos="6480"/>
+        </w:tabs>
+        <w:ind w:left="6480" w:hanging="360"/>
+      </w:pPr>
+      <w:rPr>
+        <w:rFonts w:ascii="Wingdings" w:hAnsi="Wingdings" w:hint="default"/>
+        <w:sz w:val="20"/>
+      </w:rPr>
+    </w:lvl>
+  </w:abstractNum>
+  <w:abstractNum w:abstractNumId="5" w15:restartNumberingAfterBreak="0">
     <w:nsid w:val="2C700A5B"/>
     <w:multiLevelType w:val="multilevel"/>
     <w:tmpl w:val="0EA2AEF2"/>
@@ -5579,7 +6088,7 @@
       </w:pPr>
     </w:lvl>
   </w:abstractNum>
-  <w:abstractNum w:abstractNumId="4" w15:restartNumberingAfterBreak="0">
+  <w:abstractNum w:abstractNumId="6" w15:restartNumberingAfterBreak="0">
     <w:nsid w:val="2ECC0F1A"/>
     <w:multiLevelType w:val="multilevel"/>
     <w:tmpl w:val="3530F5D2"/>
@@ -5692,7 +6201,7 @@
       </w:pPr>
     </w:lvl>
   </w:abstractNum>
-  <w:abstractNum w:abstractNumId="5" w15:restartNumberingAfterBreak="0">
+  <w:abstractNum w:abstractNumId="7" w15:restartNumberingAfterBreak="0">
     <w:nsid w:val="33DB279E"/>
     <w:multiLevelType w:val="multilevel"/>
     <w:tmpl w:val="3A7E6002"/>
@@ -5841,7 +6350,7 @@
       </w:rPr>
     </w:lvl>
   </w:abstractNum>
-  <w:abstractNum w:abstractNumId="6" w15:restartNumberingAfterBreak="0">
+  <w:abstractNum w:abstractNumId="8" w15:restartNumberingAfterBreak="0">
     <w:nsid w:val="3FA26844"/>
     <w:multiLevelType w:val="hybridMultilevel"/>
     <w:tmpl w:val="A2983700"/>
@@ -5932,7 +6441,7 @@
       </w:pPr>
     </w:lvl>
   </w:abstractNum>
-  <w:abstractNum w:abstractNumId="7" w15:restartNumberingAfterBreak="0">
+  <w:abstractNum w:abstractNumId="9" w15:restartNumberingAfterBreak="0">
     <w:nsid w:val="43DC23D8"/>
     <w:multiLevelType w:val="multilevel"/>
     <w:tmpl w:val="B5C6ECC0"/>
@@ -6081,7 +6590,7 @@
       </w:rPr>
     </w:lvl>
   </w:abstractNum>
-  <w:abstractNum w:abstractNumId="8" w15:restartNumberingAfterBreak="0">
+  <w:abstractNum w:abstractNumId="10" w15:restartNumberingAfterBreak="0">
     <w:nsid w:val="455E5E00"/>
     <w:multiLevelType w:val="multilevel"/>
     <w:tmpl w:val="F916890A"/>
@@ -6230,7 +6739,156 @@
       </w:rPr>
     </w:lvl>
   </w:abstractNum>
-  <w:abstractNum w:abstractNumId="9" w15:restartNumberingAfterBreak="0">
+  <w:abstractNum w:abstractNumId="11" w15:restartNumberingAfterBreak="0">
+    <w:nsid w:val="51015C25"/>
+    <w:multiLevelType w:val="multilevel"/>
+    <w:tmpl w:val="902C726C"/>
+    <w:lvl w:ilvl="0">
+      <w:start w:val="1"/>
+      <w:numFmt w:val="bullet"/>
+      <w:lvlText w:val=""/>
+      <w:lvlJc w:val="left"/>
+      <w:pPr>
+        <w:tabs>
+          <w:tab w:val="num" w:pos="720"/>
+        </w:tabs>
+        <w:ind w:left="720" w:hanging="360"/>
+      </w:pPr>
+      <w:rPr>
+        <w:rFonts w:ascii="Symbol" w:hAnsi="Symbol" w:hint="default"/>
+        <w:sz w:val="20"/>
+      </w:rPr>
+    </w:lvl>
+    <w:lvl w:ilvl="1" w:tentative="1">
+      <w:start w:val="1"/>
+      <w:numFmt w:val="bullet"/>
+      <w:lvlText w:val="o"/>
+      <w:lvlJc w:val="left"/>
+      <w:pPr>
+        <w:tabs>
+          <w:tab w:val="num" w:pos="1440"/>
+        </w:tabs>
+        <w:ind w:left="1440" w:hanging="360"/>
+      </w:pPr>
+      <w:rPr>
+        <w:rFonts w:ascii="Courier New" w:hAnsi="Courier New" w:hint="default"/>
+        <w:sz w:val="20"/>
+      </w:rPr>
+    </w:lvl>
+    <w:lvl w:ilvl="2" w:tentative="1">
+      <w:start w:val="1"/>
+      <w:numFmt w:val="bullet"/>
+      <w:lvlText w:val=""/>
+      <w:lvlJc w:val="left"/>
+      <w:pPr>
+        <w:tabs>
+          <w:tab w:val="num" w:pos="2160"/>
+        </w:tabs>
+        <w:ind w:left="2160" w:hanging="360"/>
+      </w:pPr>
+      <w:rPr>
+        <w:rFonts w:ascii="Wingdings" w:hAnsi="Wingdings" w:hint="default"/>
+        <w:sz w:val="20"/>
+      </w:rPr>
+    </w:lvl>
+    <w:lvl w:ilvl="3" w:tentative="1">
+      <w:start w:val="1"/>
+      <w:numFmt w:val="bullet"/>
+      <w:lvlText w:val=""/>
+      <w:lvlJc w:val="left"/>
+      <w:pPr>
+        <w:tabs>
+          <w:tab w:val="num" w:pos="2880"/>
+        </w:tabs>
+        <w:ind w:left="2880" w:hanging="360"/>
+      </w:pPr>
+      <w:rPr>
+        <w:rFonts w:ascii="Wingdings" w:hAnsi="Wingdings" w:hint="default"/>
+        <w:sz w:val="20"/>
+      </w:rPr>
+    </w:lvl>
+    <w:lvl w:ilvl="4" w:tentative="1">
+      <w:start w:val="1"/>
+      <w:numFmt w:val="bullet"/>
+      <w:lvlText w:val=""/>
+      <w:lvlJc w:val="left"/>
+      <w:pPr>
+        <w:tabs>
+          <w:tab w:val="num" w:pos="3600"/>
+        </w:tabs>
+        <w:ind w:left="3600" w:hanging="360"/>
+      </w:pPr>
+      <w:rPr>
+        <w:rFonts w:ascii="Wingdings" w:hAnsi="Wingdings" w:hint="default"/>
+        <w:sz w:val="20"/>
+      </w:rPr>
+    </w:lvl>
+    <w:lvl w:ilvl="5" w:tentative="1">
+      <w:start w:val="1"/>
+      <w:numFmt w:val="bullet"/>
+      <w:lvlText w:val=""/>
+      <w:lvlJc w:val="left"/>
+      <w:pPr>
+        <w:tabs>
+          <w:tab w:val="num" w:pos="4320"/>
+        </w:tabs>
+        <w:ind w:left="4320" w:hanging="360"/>
+      </w:pPr>
+      <w:rPr>
+        <w:rFonts w:ascii="Wingdings" w:hAnsi="Wingdings" w:hint="default"/>
+        <w:sz w:val="20"/>
+      </w:rPr>
+    </w:lvl>
+    <w:lvl w:ilvl="6" w:tentative="1">
+      <w:start w:val="1"/>
+      <w:numFmt w:val="bullet"/>
+      <w:lvlText w:val=""/>
+      <w:lvlJc w:val="left"/>
+      <w:pPr>
+        <w:tabs>
+          <w:tab w:val="num" w:pos="5040"/>
+        </w:tabs>
+        <w:ind w:left="5040" w:hanging="360"/>
+      </w:pPr>
+      <w:rPr>
+        <w:rFonts w:ascii="Wingdings" w:hAnsi="Wingdings" w:hint="default"/>
+        <w:sz w:val="20"/>
+      </w:rPr>
+    </w:lvl>
+    <w:lvl w:ilvl="7" w:tentative="1">
+      <w:start w:val="1"/>
+      <w:numFmt w:val="bullet"/>
+      <w:lvlText w:val=""/>
+      <w:lvlJc w:val="left"/>
+      <w:pPr>
+        <w:tabs>
+          <w:tab w:val="num" w:pos="5760"/>
+        </w:tabs>
+        <w:ind w:left="5760" w:hanging="360"/>
+      </w:pPr>
+      <w:rPr>
+        <w:rFonts w:ascii="Wingdings" w:hAnsi="Wingdings" w:hint="default"/>
+        <w:sz w:val="20"/>
+      </w:rPr>
+    </w:lvl>
+    <w:lvl w:ilvl="8" w:tentative="1">
+      <w:start w:val="1"/>
+      <w:numFmt w:val="bullet"/>
+      <w:lvlText w:val=""/>
+      <w:lvlJc w:val="left"/>
+      <w:pPr>
+        <w:tabs>
+          <w:tab w:val="num" w:pos="6480"/>
+        </w:tabs>
+        <w:ind w:left="6480" w:hanging="360"/>
+      </w:pPr>
+      <w:rPr>
+        <w:rFonts w:ascii="Wingdings" w:hAnsi="Wingdings" w:hint="default"/>
+        <w:sz w:val="20"/>
+      </w:rPr>
+    </w:lvl>
+  </w:abstractNum>
+  <w:abstractNum w:abstractNumId="12" w15:restartNumberingAfterBreak="0">
     <w:nsid w:val="5AD13B5F"/>
     <w:multiLevelType w:val="hybridMultilevel"/>
     <w:tmpl w:val="0E36ACA4"/>
@@ -6345,7 +7003,7 @@
       </w:rPr>
     </w:lvl>
   </w:abstractNum>
-  <w:abstractNum w:abstractNumId="10" w15:restartNumberingAfterBreak="0">
+  <w:abstractNum w:abstractNumId="13" w15:restartNumberingAfterBreak="0">
     <w:nsid w:val="612C3000"/>
     <w:multiLevelType w:val="multilevel"/>
     <w:tmpl w:val="39DE7D3A"/>
@@ -6494,7 +7152,7 @@
       </w:rPr>
     </w:lvl>
   </w:abstractNum>
-  <w:abstractNum w:abstractNumId="11" w15:restartNumberingAfterBreak="0">
+  <w:abstractNum w:abstractNumId="14" w15:restartNumberingAfterBreak="0">
     <w:nsid w:val="674D4AAA"/>
     <w:multiLevelType w:val="multilevel"/>
     <w:tmpl w:val="5F56F58E"/>
@@ -6643,7 +7301,7 @@
       </w:rPr>
     </w:lvl>
   </w:abstractNum>
-  <w:abstractNum w:abstractNumId="12" w15:restartNumberingAfterBreak="0">
+  <w:abstractNum w:abstractNumId="15" w15:restartNumberingAfterBreak="0">
     <w:nsid w:val="69291B7F"/>
     <w:multiLevelType w:val="multilevel"/>
     <w:tmpl w:val="1D7A1EB8"/>
@@ -6792,7 +7450,7 @@
       </w:rPr>
     </w:lvl>
   </w:abstractNum>
-  <w:abstractNum w:abstractNumId="13" w15:restartNumberingAfterBreak="0">
+  <w:abstractNum w:abstractNumId="16" w15:restartNumberingAfterBreak="0">
     <w:nsid w:val="6CC91A80"/>
     <w:multiLevelType w:val="multilevel"/>
     <w:tmpl w:val="C9A424E8"/>
@@ -6905,7 +7563,7 @@
       </w:pPr>
     </w:lvl>
   </w:abstractNum>
-  <w:abstractNum w:abstractNumId="14" w15:restartNumberingAfterBreak="0">
+  <w:abstractNum w:abstractNumId="17" w15:restartNumberingAfterBreak="0">
     <w:nsid w:val="72B01245"/>
     <w:multiLevelType w:val="multilevel"/>
     <w:tmpl w:val="1D62A1B8"/>
@@ -7018,7 +7676,7 @@
       </w:pPr>
     </w:lvl>
   </w:abstractNum>
-  <w:abstractNum w:abstractNumId="15" w15:restartNumberingAfterBreak="0">
+  <w:abstractNum w:abstractNumId="18" w15:restartNumberingAfterBreak="0">
     <w:nsid w:val="74C74D7F"/>
     <w:multiLevelType w:val="multilevel"/>
     <w:tmpl w:val="8FFE892C"/>
@@ -7167,7 +7825,7 @@
       </w:rPr>
     </w:lvl>
   </w:abstractNum>
-  <w:abstractNum w:abstractNumId="16" w15:restartNumberingAfterBreak="0">
+  <w:abstractNum w:abstractNumId="19" w15:restartNumberingAfterBreak="0">
     <w:nsid w:val="7A875C8D"/>
     <w:multiLevelType w:val="multilevel"/>
     <w:tmpl w:val="A0C4220C"/>
@@ -7280,7 +7938,7 @@
       </w:pPr>
     </w:lvl>
   </w:abstractNum>
-  <w:abstractNum w:abstractNumId="17" w15:restartNumberingAfterBreak="0">
+  <w:abstractNum w:abstractNumId="20" w15:restartNumberingAfterBreak="0">
     <w:nsid w:val="7B9028F5"/>
     <w:multiLevelType w:val="multilevel"/>
     <w:tmpl w:val="FD24D99C"/>
@@ -7394,57 +8052,66 @@
     </w:lvl>
   </w:abstractNum>
   <w:num w:numId="1" w16cid:durableId="716005531">
+    <w:abstractNumId w:val="20"/>
+  </w:num>
+  <w:num w:numId="2" w16cid:durableId="1291086473">
+    <w:abstractNumId w:val="15"/>
+  </w:num>
+  <w:num w:numId="3" w16cid:durableId="1728186027">
+    <w:abstractNumId w:val="19"/>
+  </w:num>
+  <w:num w:numId="4" w16cid:durableId="1324550757">
+    <w:abstractNumId w:val="7"/>
+  </w:num>
+  <w:num w:numId="5" w16cid:durableId="1292322548">
+    <w:abstractNumId w:val="13"/>
+  </w:num>
+  <w:num w:numId="6" w16cid:durableId="1879391637">
+    <w:abstractNumId w:val="10"/>
+  </w:num>
+  <w:num w:numId="7" w16cid:durableId="1091312158">
     <w:abstractNumId w:val="17"/>
   </w:num>
-  <w:num w:numId="2" w16cid:durableId="1291086473">
-    <w:abstractNumId w:val="12"/>
-  </w:num>
-  <w:num w:numId="3" w16cid:durableId="1728186027">
-    <w:abstractNumId w:val="16"/>
-  </w:num>
-  <w:num w:numId="4" w16cid:durableId="1324550757">
-    <w:abstractNumId w:val="5"/>
-  </w:num>
-  <w:num w:numId="5" w16cid:durableId="1292322548">
-    <w:abstractNumId w:val="10"/>
-  </w:num>
-  <w:num w:numId="6" w16cid:durableId="1879391637">
-    <w:abstractNumId w:val="8"/>
-  </w:num>
-  <w:num w:numId="7" w16cid:durableId="1091312158">
-    <w:abstractNumId w:val="14"/>
-  </w:num>
   <w:num w:numId="8" w16cid:durableId="1695571666">
-    <w:abstractNumId w:val="7"/>
+    <w:abstractNumId w:val="9"/>
   </w:num>
   <w:num w:numId="9" w16cid:durableId="30035144">
     <w:abstractNumId w:val="2"/>
   </w:num>
   <w:num w:numId="10" w16cid:durableId="649676895">
-    <w:abstractNumId w:val="11"/>
+    <w:abstractNumId w:val="14"/>
   </w:num>
   <w:num w:numId="11" w16cid:durableId="703555149">
-    <w:abstractNumId w:val="15"/>
+    <w:abstractNumId w:val="18"/>
   </w:num>
   <w:num w:numId="12" w16cid:durableId="633607783">
-    <w:abstractNumId w:val="13"/>
+    <w:abstractNumId w:val="16"/>
   </w:num>
   <w:num w:numId="13" w16cid:durableId="187371678">
-    <w:abstractNumId w:val="4"/>
+    <w:abstractNumId w:val="6"/>
   </w:num>
   <w:num w:numId="14" w16cid:durableId="1475903465">
     <w:abstractNumId w:val="0"/>
   </w:num>
   <w:num w:numId="15" w16cid:durableId="1813326420">
-    <w:abstractNumId w:val="6"/>
+    <w:abstractNumId w:val="8"/>
   </w:num>
   <w:num w:numId="16" w16cid:durableId="1487626928">
-    <w:abstractNumId w:val="9"/>
+    <w:abstractNumId w:val="12"/>
   </w:num>
   <w:num w:numId="17" w16cid:durableId="1096513217">
     <w:abstractNumId w:val="1"/>
   </w:num>
   <w:num w:numId="18" w16cid:durableId="241647393">
+    <w:abstractNumId w:val="5"/>
+  </w:num>
+  <w:num w:numId="19" w16cid:durableId="1877883759">
+    <w:abstractNumId w:val="4"/>
+  </w:num>
+  <w:num w:numId="20" w16cid:durableId="434718001">
+    <w:abstractNumId w:val="11"/>
+  </w:num>
+  <w:num w:numId="21" w16cid:durableId="1165439769">
     <w:abstractNumId w:val="3"/>
   </w:num>
 </w:numbering>
@@ -8056,7 +8723,6 @@
   <w:style w:type="character" w:default="1" w:styleId="DefaultParagraphFont">
     <w:name w:val="Default Paragraph Font"/>
     <w:uiPriority w:val="1"/>
-    <w:semiHidden/>
     <w:unhideWhenUsed/>
   </w:style>
   <w:style w:type="table" w:default="1" w:styleId="TableNormal">

</xml_diff>